<commit_message>
Date: 06 Jan 2026
</commit_message>
<xml_diff>
--- a/Assignments_SA2510014.docx
+++ b/Assignments_SA2510014.docx
@@ -84,7 +84,6 @@
         </w:rPr>
         <w:t xml:space="preserve">What is the purpose and return type of method </w:t>
       </w:r>
-      <w:proofErr w:type="gramStart"/>
       <w:r>
         <w:rPr>
           <w:b/>
@@ -93,18 +92,7 @@
           <w:szCs w:val="22"/>
           <w:lang w:val="en-US"/>
         </w:rPr>
-        <w:t>getPageSource(</w:t>
-      </w:r>
-      <w:proofErr w:type="gramEnd"/>
-      <w:r>
-        <w:rPr>
-          <w:b/>
-          <w:bCs/>
-          <w:sz w:val="24"/>
-          <w:szCs w:val="22"/>
-          <w:lang w:val="en-US"/>
-        </w:rPr>
-        <w:t>)?</w:t>
+        <w:t>getPageSource()?</w:t>
       </w:r>
     </w:p>
     <w:p>
@@ -159,25 +147,7 @@
           <w:szCs w:val="22"/>
           <w:lang w:val="en-US"/>
         </w:rPr>
-        <w:t>Enter your name as user name (</w:t>
-      </w:r>
-      <w:proofErr w:type="spellStart"/>
-      <w:r>
-        <w:rPr>
-          <w:sz w:val="24"/>
-          <w:szCs w:val="22"/>
-          <w:lang w:val="en-US"/>
-        </w:rPr>
-        <w:t>abhinav</w:t>
-      </w:r>
-      <w:proofErr w:type="spellEnd"/>
-      <w:r>
-        <w:rPr>
-          <w:sz w:val="24"/>
-          <w:szCs w:val="22"/>
-          <w:lang w:val="en-US"/>
-        </w:rPr>
-        <w:t>)</w:t>
+        <w:t>Enter your name as user name (abhinav)</w:t>
       </w:r>
     </w:p>
     <w:p>
@@ -294,25 +264,7 @@
           <w:szCs w:val="22"/>
           <w:lang w:val="en-US"/>
         </w:rPr>
-        <w:t>Enter your name as user name (</w:t>
-      </w:r>
-      <w:proofErr w:type="spellStart"/>
-      <w:r>
-        <w:rPr>
-          <w:sz w:val="24"/>
-          <w:szCs w:val="22"/>
-          <w:lang w:val="en-US"/>
-        </w:rPr>
-        <w:t>abhinav</w:t>
-      </w:r>
-      <w:proofErr w:type="spellEnd"/>
-      <w:r>
-        <w:rPr>
-          <w:sz w:val="24"/>
-          <w:szCs w:val="22"/>
-          <w:lang w:val="en-US"/>
-        </w:rPr>
-        <w:t>)</w:t>
+        <w:t>Enter your name as user name (abhinav)</w:t>
       </w:r>
     </w:p>
     <w:p>
@@ -374,27 +326,7 @@
           <w:szCs w:val="22"/>
           <w:lang w:val="en-US"/>
         </w:rPr>
-        <w:t xml:space="preserve">Use </w:t>
-      </w:r>
-      <w:r>
-        <w:rPr>
-          <w:b/>
-          <w:bCs/>
-          <w:sz w:val="24"/>
-          <w:szCs w:val="22"/>
-          <w:lang w:val="en-US"/>
-        </w:rPr>
-        <w:t>Id</w:t>
-      </w:r>
-      <w:r>
-        <w:rPr>
-          <w:b/>
-          <w:bCs/>
-          <w:sz w:val="24"/>
-          <w:szCs w:val="22"/>
-          <w:lang w:val="en-US"/>
-        </w:rPr>
-        <w:t xml:space="preserve"> Locator</w:t>
+        <w:t>Use Id Locator</w:t>
       </w:r>
     </w:p>
     <w:p>
@@ -449,25 +381,7 @@
           <w:szCs w:val="22"/>
           <w:lang w:val="en-US"/>
         </w:rPr>
-        <w:t>Enter your name as user name (</w:t>
-      </w:r>
-      <w:proofErr w:type="spellStart"/>
-      <w:r>
-        <w:rPr>
-          <w:sz w:val="24"/>
-          <w:szCs w:val="22"/>
-          <w:lang w:val="en-US"/>
-        </w:rPr>
-        <w:t>abhinav</w:t>
-      </w:r>
-      <w:proofErr w:type="spellEnd"/>
-      <w:r>
-        <w:rPr>
-          <w:sz w:val="24"/>
-          <w:szCs w:val="22"/>
-          <w:lang w:val="en-US"/>
-        </w:rPr>
-        <w:t>)</w:t>
+        <w:t>Enter your name as user name (abhinav)</w:t>
       </w:r>
     </w:p>
     <w:p>
@@ -529,27 +443,7 @@
           <w:szCs w:val="22"/>
           <w:lang w:val="en-US"/>
         </w:rPr>
-        <w:t xml:space="preserve">Use </w:t>
-      </w:r>
-      <w:r>
-        <w:rPr>
-          <w:b/>
-          <w:bCs/>
-          <w:sz w:val="24"/>
-          <w:szCs w:val="22"/>
-          <w:lang w:val="en-US"/>
-        </w:rPr>
-        <w:t>className</w:t>
-      </w:r>
-      <w:r>
-        <w:rPr>
-          <w:b/>
-          <w:bCs/>
-          <w:sz w:val="24"/>
-          <w:szCs w:val="22"/>
-          <w:lang w:val="en-US"/>
-        </w:rPr>
-        <w:t xml:space="preserve"> Locator</w:t>
+        <w:t>Use className Locator</w:t>
       </w:r>
     </w:p>
     <w:p>
@@ -916,6 +810,40 @@
     </w:p>
     <w:p>
       <w:pPr>
+        <w:rPr>
+          <w:sz w:val="24"/>
+          <w:szCs w:val="22"/>
+          <w:lang w:val="en-US"/>
+        </w:rPr>
+      </w:pPr>
+    </w:p>
+    <w:p>
+      <w:pPr>
+        <w:rPr>
+          <w:sz w:val="24"/>
+          <w:szCs w:val="22"/>
+          <w:lang w:val="en-US"/>
+        </w:rPr>
+      </w:pPr>
+      <w:r>
+        <w:rPr>
+          <w:sz w:val="24"/>
+          <w:szCs w:val="22"/>
+          <w:lang w:val="en-US"/>
+        </w:rPr>
+        <w:t>Date: 06 Jan 2026</w:t>
+      </w:r>
+      <w:r>
+        <w:rPr>
+          <w:sz w:val="24"/>
+          <w:szCs w:val="22"/>
+          <w:lang w:val="en-US"/>
+        </w:rPr>
+        <w:br/>
+      </w:r>
+    </w:p>
+    <w:p>
+      <w:pPr>
         <w:pStyle w:val="ListParagraph"/>
         <w:numPr>
           <w:ilvl w:val="0"/>
@@ -927,8 +855,399 @@
           <w:lang w:val="en-US"/>
         </w:rPr>
       </w:pPr>
+      <w:r>
+        <w:rPr>
+          <w:sz w:val="24"/>
+          <w:szCs w:val="22"/>
+          <w:lang w:val="en-US"/>
+        </w:rPr>
+        <w:t xml:space="preserve">Launch </w:t>
+      </w:r>
+      <w:hyperlink r:id="rId12" w:history="1">
+        <w:r>
+          <w:rPr>
+            <w:rStyle w:val="Hyperlink"/>
+            <w:sz w:val="24"/>
+            <w:szCs w:val="22"/>
+            <w:lang w:val="en-US"/>
+          </w:rPr>
+          <w:t>https://practicetestautomation.com/practice-test-login/</w:t>
+        </w:r>
+      </w:hyperlink>
+    </w:p>
+    <w:p>
+      <w:pPr>
+        <w:pStyle w:val="ListParagraph"/>
+        <w:numPr>
+          <w:ilvl w:val="1"/>
+          <w:numId w:val="1"/>
+        </w:numPr>
+        <w:rPr>
+          <w:sz w:val="24"/>
+          <w:szCs w:val="22"/>
+          <w:lang w:val="en-US"/>
+        </w:rPr>
+      </w:pPr>
+      <w:r>
+        <w:rPr>
+          <w:sz w:val="24"/>
+          <w:szCs w:val="22"/>
+          <w:lang w:val="en-US"/>
+        </w:rPr>
+        <w:t>Enter user name – student</w:t>
+      </w:r>
+    </w:p>
+    <w:p>
+      <w:pPr>
+        <w:pStyle w:val="ListParagraph"/>
+        <w:numPr>
+          <w:ilvl w:val="1"/>
+          <w:numId w:val="1"/>
+        </w:numPr>
+        <w:rPr>
+          <w:sz w:val="24"/>
+          <w:szCs w:val="22"/>
+          <w:lang w:val="en-US"/>
+        </w:rPr>
+      </w:pPr>
+      <w:r>
+        <w:rPr>
+          <w:sz w:val="24"/>
+          <w:szCs w:val="22"/>
+          <w:lang w:val="en-US"/>
+        </w:rPr>
+        <w:t>Enter password – Password</w:t>
+      </w:r>
+    </w:p>
+    <w:p>
+      <w:pPr>
+        <w:pStyle w:val="ListParagraph"/>
+        <w:numPr>
+          <w:ilvl w:val="1"/>
+          <w:numId w:val="1"/>
+        </w:numPr>
+        <w:rPr>
+          <w:sz w:val="24"/>
+          <w:szCs w:val="22"/>
+          <w:lang w:val="en-US"/>
+        </w:rPr>
+      </w:pPr>
+      <w:r>
+        <w:rPr>
+          <w:sz w:val="24"/>
+          <w:szCs w:val="22"/>
+          <w:lang w:val="en-US"/>
+        </w:rPr>
+        <w:t>Click on login button</w:t>
+      </w:r>
+    </w:p>
+    <w:p>
+      <w:pPr>
+        <w:pStyle w:val="ListParagraph"/>
+        <w:numPr>
+          <w:ilvl w:val="1"/>
+          <w:numId w:val="1"/>
+        </w:numPr>
+        <w:rPr>
+          <w:sz w:val="24"/>
+          <w:szCs w:val="22"/>
+          <w:lang w:val="en-US"/>
+        </w:rPr>
+      </w:pPr>
+      <w:r>
+        <w:rPr>
+          <w:sz w:val="24"/>
+          <w:szCs w:val="22"/>
+          <w:lang w:val="en-US"/>
+        </w:rPr>
+        <w:t>Display the URL if login is successful</w:t>
+      </w:r>
+    </w:p>
+    <w:p>
+      <w:pPr>
+        <w:pStyle w:val="ListParagraph"/>
+        <w:numPr>
+          <w:ilvl w:val="1"/>
+          <w:numId w:val="1"/>
+        </w:numPr>
+        <w:rPr>
+          <w:sz w:val="24"/>
+          <w:szCs w:val="22"/>
+          <w:lang w:val="en-US"/>
+        </w:rPr>
+      </w:pPr>
+      <w:r>
+        <w:rPr>
+          <w:sz w:val="24"/>
+          <w:szCs w:val="22"/>
+          <w:lang w:val="en-US"/>
+        </w:rPr>
+        <w:lastRenderedPageBreak/>
+        <w:t>Display the message that is displayed on the home page (</w:t>
+      </w:r>
+      <w:r>
+        <w:rPr>
+          <w:sz w:val="24"/>
+          <w:szCs w:val="22"/>
+          <w:lang w:val="en-US"/>
+        </w:rPr>
+        <w:t>Logged In Successfully</w:t>
+      </w:r>
+      <w:r>
+        <w:rPr>
+          <w:sz w:val="24"/>
+          <w:szCs w:val="22"/>
+          <w:lang w:val="en-US"/>
+        </w:rPr>
+        <w:t>)</w:t>
+      </w:r>
+    </w:p>
+    <w:p>
+      <w:pPr>
+        <w:pStyle w:val="ListParagraph"/>
+        <w:numPr>
+          <w:ilvl w:val="1"/>
+          <w:numId w:val="1"/>
+        </w:numPr>
+        <w:rPr>
+          <w:sz w:val="24"/>
+          <w:szCs w:val="22"/>
+          <w:lang w:val="en-US"/>
+        </w:rPr>
+      </w:pPr>
+      <w:r>
+        <w:rPr>
+          <w:sz w:val="24"/>
+          <w:szCs w:val="22"/>
+          <w:lang w:val="en-US"/>
+        </w:rPr>
+        <w:t>Click on Logout button.</w:t>
+      </w:r>
+      <w:r>
+        <w:rPr>
+          <w:sz w:val="24"/>
+          <w:szCs w:val="22"/>
+          <w:lang w:val="en-US"/>
+        </w:rPr>
+        <w:t xml:space="preserve"> (for this control use link text / partial link text)</w:t>
+      </w:r>
       <w:bookmarkStart w:id="0" w:name="_GoBack"/>
       <w:bookmarkEnd w:id="0"/>
+      <w:r>
+        <w:rPr>
+          <w:sz w:val="24"/>
+          <w:szCs w:val="22"/>
+          <w:lang w:val="en-US"/>
+        </w:rPr>
+        <w:br/>
+      </w:r>
+      <w:r>
+        <w:rPr>
+          <w:b/>
+          <w:bCs/>
+          <w:sz w:val="24"/>
+          <w:szCs w:val="22"/>
+          <w:lang w:val="en-US"/>
+        </w:rPr>
+        <w:t>Use CssSelector attributes</w:t>
+      </w:r>
+    </w:p>
+    <w:p>
+      <w:pPr>
+        <w:pStyle w:val="ListParagraph"/>
+        <w:numPr>
+          <w:ilvl w:val="0"/>
+          <w:numId w:val="1"/>
+        </w:numPr>
+        <w:rPr>
+          <w:sz w:val="24"/>
+          <w:szCs w:val="22"/>
+          <w:lang w:val="en-US"/>
+        </w:rPr>
+      </w:pPr>
+      <w:r>
+        <w:rPr>
+          <w:sz w:val="24"/>
+          <w:szCs w:val="22"/>
+          <w:lang w:val="en-US"/>
+        </w:rPr>
+        <w:t xml:space="preserve">Launch </w:t>
+      </w:r>
+      <w:hyperlink r:id="rId13" w:history="1">
+        <w:r>
+          <w:rPr>
+            <w:rStyle w:val="Hyperlink"/>
+            <w:sz w:val="24"/>
+            <w:szCs w:val="22"/>
+            <w:lang w:val="en-US"/>
+          </w:rPr>
+          <w:t>https://register.rediff.com/register/register.php?FormName=user_details</w:t>
+        </w:r>
+      </w:hyperlink>
+    </w:p>
+    <w:p>
+      <w:pPr>
+        <w:pStyle w:val="ListParagraph"/>
+        <w:numPr>
+          <w:ilvl w:val="1"/>
+          <w:numId w:val="1"/>
+        </w:numPr>
+        <w:rPr>
+          <w:sz w:val="24"/>
+          <w:szCs w:val="22"/>
+          <w:lang w:val="en-US"/>
+        </w:rPr>
+      </w:pPr>
+      <w:r>
+        <w:rPr>
+          <w:sz w:val="24"/>
+          <w:szCs w:val="22"/>
+          <w:lang w:val="en-US"/>
+        </w:rPr>
+        <w:t>Enter full name</w:t>
+      </w:r>
+    </w:p>
+    <w:p>
+      <w:pPr>
+        <w:pStyle w:val="ListParagraph"/>
+        <w:numPr>
+          <w:ilvl w:val="1"/>
+          <w:numId w:val="1"/>
+        </w:numPr>
+        <w:rPr>
+          <w:sz w:val="24"/>
+          <w:szCs w:val="22"/>
+          <w:lang w:val="en-US"/>
+        </w:rPr>
+      </w:pPr>
+      <w:r>
+        <w:rPr>
+          <w:sz w:val="24"/>
+          <w:szCs w:val="22"/>
+          <w:lang w:val="en-US"/>
+        </w:rPr>
+        <w:t>Enter Rediff id</w:t>
+      </w:r>
+    </w:p>
+    <w:p>
+      <w:pPr>
+        <w:pStyle w:val="ListParagraph"/>
+        <w:numPr>
+          <w:ilvl w:val="1"/>
+          <w:numId w:val="1"/>
+        </w:numPr>
+        <w:rPr>
+          <w:sz w:val="24"/>
+          <w:szCs w:val="22"/>
+          <w:lang w:val="en-US"/>
+        </w:rPr>
+      </w:pPr>
+      <w:r>
+        <w:rPr>
+          <w:sz w:val="24"/>
+          <w:szCs w:val="22"/>
+          <w:lang w:val="en-US"/>
+        </w:rPr>
+        <w:t>Enter password</w:t>
+      </w:r>
+    </w:p>
+    <w:p>
+      <w:pPr>
+        <w:pStyle w:val="ListParagraph"/>
+        <w:numPr>
+          <w:ilvl w:val="1"/>
+          <w:numId w:val="1"/>
+        </w:numPr>
+        <w:rPr>
+          <w:sz w:val="24"/>
+          <w:szCs w:val="22"/>
+          <w:lang w:val="en-US"/>
+        </w:rPr>
+      </w:pPr>
+      <w:r>
+        <w:rPr>
+          <w:sz w:val="24"/>
+          <w:szCs w:val="22"/>
+          <w:lang w:val="en-US"/>
+        </w:rPr>
+        <w:t>Enter confirm password</w:t>
+      </w:r>
+    </w:p>
+    <w:p>
+      <w:pPr>
+        <w:pStyle w:val="ListParagraph"/>
+        <w:numPr>
+          <w:ilvl w:val="1"/>
+          <w:numId w:val="1"/>
+        </w:numPr>
+        <w:rPr>
+          <w:sz w:val="24"/>
+          <w:szCs w:val="22"/>
+          <w:lang w:val="en-US"/>
+        </w:rPr>
+      </w:pPr>
+      <w:r>
+        <w:rPr>
+          <w:sz w:val="24"/>
+          <w:szCs w:val="22"/>
+          <w:lang w:val="en-US"/>
+        </w:rPr>
+        <w:t>Enter recovery email</w:t>
+      </w:r>
+    </w:p>
+    <w:p>
+      <w:pPr>
+        <w:pStyle w:val="ListParagraph"/>
+        <w:numPr>
+          <w:ilvl w:val="1"/>
+          <w:numId w:val="1"/>
+        </w:numPr>
+        <w:rPr>
+          <w:sz w:val="24"/>
+          <w:szCs w:val="22"/>
+          <w:lang w:val="en-US"/>
+        </w:rPr>
+      </w:pPr>
+      <w:r>
+        <w:rPr>
+          <w:sz w:val="24"/>
+          <w:szCs w:val="22"/>
+          <w:lang w:val="en-US"/>
+        </w:rPr>
+        <w:t>Enter phone no</w:t>
+      </w:r>
+      <w:r>
+        <w:rPr>
+          <w:sz w:val="24"/>
+          <w:szCs w:val="22"/>
+          <w:lang w:val="en-US"/>
+        </w:rPr>
+        <w:br/>
+      </w:r>
+      <w:r>
+        <w:rPr>
+          <w:b/>
+          <w:bCs/>
+          <w:sz w:val="24"/>
+          <w:szCs w:val="22"/>
+          <w:lang w:val="en-US"/>
+        </w:rPr>
+        <w:t>Use CssSelector special characters</w:t>
+      </w:r>
+    </w:p>
+    <w:p>
+      <w:pPr>
+        <w:pStyle w:val="ListParagraph"/>
+        <w:numPr>
+          <w:ilvl w:val="0"/>
+          <w:numId w:val="1"/>
+        </w:numPr>
+        <w:rPr>
+          <w:sz w:val="24"/>
+          <w:szCs w:val="22"/>
+          <w:lang w:val="en-US"/>
+        </w:rPr>
+      </w:pPr>
     </w:p>
     <w:sectPr>
       <w:pgSz w:w="11906" w:h="16838"/>
@@ -943,7 +1262,7 @@
 <file path=word/numbering.xml><?xml version="1.0" encoding="utf-8"?>
 <w:numbering xmlns:wpc="http://schemas.microsoft.com/office/word/2010/wordprocessingCanvas" xmlns:mc="http://schemas.openxmlformats.org/markup-compatibility/2006" xmlns:o="urn:schemas-microsoft-com:office:office" xmlns:r="http://schemas.openxmlformats.org/officeDocument/2006/relationships" xmlns:m="http://schemas.openxmlformats.org/officeDocument/2006/math" xmlns:v="urn:schemas-microsoft-com:vml" xmlns:wp14="http://schemas.microsoft.com/office/word/2010/wordprocessingDrawing" xmlns:wp="http://schemas.openxmlformats.org/drawingml/2006/wordprocessingDrawing" xmlns:w10="urn:schemas-microsoft-com:office:word" xmlns:w="http://schemas.openxmlformats.org/wordprocessingml/2006/main" xmlns:w14="http://schemas.microsoft.com/office/word/2010/wordml" xmlns:w15="http://schemas.microsoft.com/office/word/2012/wordml" xmlns:wpg="http://schemas.microsoft.com/office/word/2010/wordprocessingGroup" xmlns:wpi="http://schemas.microsoft.com/office/word/2010/wordprocessingInk" xmlns:wne="http://schemas.microsoft.com/office/word/2006/wordml" xmlns:wps="http://schemas.microsoft.com/office/word/2010/wordprocessingShape" mc:Ignorable="w14 w15 wp14">
   <w:abstractNum w:abstractNumId="0">
-    <w:nsid w:val="79C1442D"/>
+    <w:nsid w:val="1364297E"/>
     <w:multiLevelType w:val="hybridMultilevel"/>
     <w:tmpl w:val="5E50A9F0"/>
     <w:lvl w:ilvl="0" w:tplc="4009000F">
@@ -1031,7 +1350,99 @@
       </w:pPr>
     </w:lvl>
   </w:abstractNum>
+  <w:abstractNum w:abstractNumId="1">
+    <w:nsid w:val="79C1442D"/>
+    <w:multiLevelType w:val="hybridMultilevel"/>
+    <w:tmpl w:val="5E50A9F0"/>
+    <w:lvl w:ilvl="0" w:tplc="4009000F">
+      <w:start w:val="1"/>
+      <w:numFmt w:val="decimal"/>
+      <w:lvlText w:val="%1."/>
+      <w:lvlJc w:val="left"/>
+      <w:pPr>
+        <w:ind w:left="720" w:hanging="360"/>
+      </w:pPr>
+      <w:rPr>
+        <w:rFonts w:hint="default"/>
+      </w:rPr>
+    </w:lvl>
+    <w:lvl w:ilvl="1" w:tplc="40090019">
+      <w:start w:val="1"/>
+      <w:numFmt w:val="lowerLetter"/>
+      <w:lvlText w:val="%2."/>
+      <w:lvlJc w:val="left"/>
+      <w:pPr>
+        <w:ind w:left="1440" w:hanging="360"/>
+      </w:pPr>
+    </w:lvl>
+    <w:lvl w:ilvl="2" w:tplc="4009001B" w:tentative="1">
+      <w:start w:val="1"/>
+      <w:numFmt w:val="lowerRoman"/>
+      <w:lvlText w:val="%3."/>
+      <w:lvlJc w:val="right"/>
+      <w:pPr>
+        <w:ind w:left="2160" w:hanging="180"/>
+      </w:pPr>
+    </w:lvl>
+    <w:lvl w:ilvl="3" w:tplc="4009000F" w:tentative="1">
+      <w:start w:val="1"/>
+      <w:numFmt w:val="decimal"/>
+      <w:lvlText w:val="%4."/>
+      <w:lvlJc w:val="left"/>
+      <w:pPr>
+        <w:ind w:left="2880" w:hanging="360"/>
+      </w:pPr>
+    </w:lvl>
+    <w:lvl w:ilvl="4" w:tplc="40090019" w:tentative="1">
+      <w:start w:val="1"/>
+      <w:numFmt w:val="lowerLetter"/>
+      <w:lvlText w:val="%5."/>
+      <w:lvlJc w:val="left"/>
+      <w:pPr>
+        <w:ind w:left="3600" w:hanging="360"/>
+      </w:pPr>
+    </w:lvl>
+    <w:lvl w:ilvl="5" w:tplc="4009001B" w:tentative="1">
+      <w:start w:val="1"/>
+      <w:numFmt w:val="lowerRoman"/>
+      <w:lvlText w:val="%6."/>
+      <w:lvlJc w:val="right"/>
+      <w:pPr>
+        <w:ind w:left="4320" w:hanging="180"/>
+      </w:pPr>
+    </w:lvl>
+    <w:lvl w:ilvl="6" w:tplc="4009000F" w:tentative="1">
+      <w:start w:val="1"/>
+      <w:numFmt w:val="decimal"/>
+      <w:lvlText w:val="%7."/>
+      <w:lvlJc w:val="left"/>
+      <w:pPr>
+        <w:ind w:left="5040" w:hanging="360"/>
+      </w:pPr>
+    </w:lvl>
+    <w:lvl w:ilvl="7" w:tplc="40090019" w:tentative="1">
+      <w:start w:val="1"/>
+      <w:numFmt w:val="lowerLetter"/>
+      <w:lvlText w:val="%8."/>
+      <w:lvlJc w:val="left"/>
+      <w:pPr>
+        <w:ind w:left="5760" w:hanging="360"/>
+      </w:pPr>
+    </w:lvl>
+    <w:lvl w:ilvl="8" w:tplc="4009001B" w:tentative="1">
+      <w:start w:val="1"/>
+      <w:numFmt w:val="lowerRoman"/>
+      <w:lvlText w:val="%9."/>
+      <w:lvlJc w:val="right"/>
+      <w:pPr>
+        <w:ind w:left="6480" w:hanging="180"/>
+      </w:pPr>
+    </w:lvl>
+  </w:abstractNum>
   <w:num w:numId="1">
+    <w:abstractNumId w:val="1"/>
+  </w:num>
+  <w:num w:numId="2">
     <w:abstractNumId w:val="0"/>
   </w:num>
 </w:numbering>

</xml_diff>

<commit_message>
Date: 16 Jan 2026
</commit_message>
<xml_diff>
--- a/Assignments_SA2510014.docx
+++ b/Assignments_SA2510014.docx
@@ -5372,22 +5372,400 @@
         </w:rPr>
         <w:t>Upload your picture</w:t>
       </w:r>
+    </w:p>
+    <w:p>
+      <w:pPr>
+        <w:spacing w:line="252" w:lineRule="auto"/>
+        <w:rPr>
+          <w:b/>
+          <w:bCs/>
+          <w:sz w:val="24"/>
+          <w:szCs w:val="24"/>
+          <w:lang w:val="en-US"/>
+        </w:rPr>
+      </w:pPr>
+    </w:p>
+    <w:p>
+      <w:pPr>
+        <w:spacing w:line="252" w:lineRule="auto"/>
+        <w:rPr>
+          <w:b/>
+          <w:bCs/>
+          <w:sz w:val="24"/>
+          <w:szCs w:val="24"/>
+          <w:lang w:val="en-US"/>
+        </w:rPr>
+      </w:pPr>
+      <w:r>
+        <w:rPr>
+          <w:b/>
+          <w:bCs/>
+          <w:sz w:val="24"/>
+          <w:szCs w:val="24"/>
+          <w:lang w:val="en-US"/>
+        </w:rPr>
+        <w:t>Date: 16 January 2026</w:t>
+      </w:r>
+    </w:p>
+    <w:p>
+      <w:pPr>
+        <w:spacing w:line="252" w:lineRule="auto"/>
+        <w:rPr>
+          <w:b/>
+          <w:bCs/>
+          <w:sz w:val="24"/>
+          <w:szCs w:val="24"/>
+          <w:lang w:val="en-US"/>
+        </w:rPr>
+      </w:pPr>
+    </w:p>
+    <w:p>
+      <w:pPr>
+        <w:pStyle w:val="ListParagraph"/>
+        <w:numPr>
+          <w:ilvl w:val="0"/>
+          <w:numId w:val="1"/>
+        </w:numPr>
+        <w:rPr>
+          <w:sz w:val="24"/>
+          <w:szCs w:val="22"/>
+          <w:lang w:val="en-US"/>
+        </w:rPr>
+      </w:pPr>
+      <w:r>
+        <w:rPr>
+          <w:sz w:val="24"/>
+          <w:szCs w:val="22"/>
+          <w:lang w:val="en-US"/>
+        </w:rPr>
+        <w:t xml:space="preserve">Open </w:t>
+      </w:r>
+      <w:hyperlink r:id="rId34" w:history="1">
+        <w:r>
+          <w:rPr>
+            <w:rStyle w:val="Hyperlink"/>
+            <w:sz w:val="24"/>
+            <w:szCs w:val="22"/>
+            <w:lang w:val="en-US"/>
+          </w:rPr>
+          <w:t>https://testautomationpractice.blogspot.com/?m=1</w:t>
+        </w:r>
+      </w:hyperlink>
+    </w:p>
+    <w:p>
+      <w:pPr>
+        <w:pStyle w:val="ListParagraph"/>
+        <w:numPr>
+          <w:ilvl w:val="1"/>
+          <w:numId w:val="1"/>
+        </w:numPr>
+        <w:rPr>
+          <w:sz w:val="24"/>
+          <w:szCs w:val="22"/>
+          <w:lang w:val="en-US"/>
+        </w:rPr>
+      </w:pPr>
+      <w:r>
+        <w:rPr>
+          <w:sz w:val="24"/>
+          <w:szCs w:val="22"/>
+          <w:lang w:val="en-US"/>
+        </w:rPr>
+        <w:t>Scroll till Upload Multiple File Control</w:t>
+      </w:r>
+    </w:p>
+    <w:p>
+      <w:pPr>
+        <w:pStyle w:val="ListParagraph"/>
+        <w:numPr>
+          <w:ilvl w:val="1"/>
+          <w:numId w:val="1"/>
+        </w:numPr>
+        <w:rPr>
+          <w:sz w:val="24"/>
+          <w:szCs w:val="22"/>
+          <w:lang w:val="en-US"/>
+        </w:rPr>
+      </w:pPr>
+      <w:r>
+        <w:rPr>
+          <w:sz w:val="24"/>
+          <w:szCs w:val="22"/>
+          <w:lang w:val="en-US"/>
+        </w:rPr>
+        <w:t>Upload any 2 file</w:t>
+      </w:r>
+    </w:p>
+    <w:p>
+      <w:pPr>
+        <w:pStyle w:val="ListParagraph"/>
+        <w:numPr>
+          <w:ilvl w:val="0"/>
+          <w:numId w:val="1"/>
+        </w:numPr>
+        <w:rPr>
+          <w:sz w:val="24"/>
+          <w:szCs w:val="22"/>
+          <w:lang w:val="en-US"/>
+        </w:rPr>
+      </w:pPr>
+      <w:r>
+        <w:rPr>
+          <w:sz w:val="24"/>
+          <w:szCs w:val="22"/>
+          <w:lang w:val="en-US"/>
+        </w:rPr>
+        <w:t xml:space="preserve">Open </w:t>
+      </w:r>
+      <w:hyperlink r:id="rId35" w:history="1">
+        <w:r>
+          <w:rPr>
+            <w:rStyle w:val="Hyperlink"/>
+            <w:sz w:val="24"/>
+            <w:szCs w:val="22"/>
+            <w:lang w:val="en-US"/>
+          </w:rPr>
+          <w:t>https://istqb.in/</w:t>
+        </w:r>
+      </w:hyperlink>
+    </w:p>
+    <w:p>
+      <w:pPr>
+        <w:pStyle w:val="ListParagraph"/>
+        <w:numPr>
+          <w:ilvl w:val="1"/>
+          <w:numId w:val="1"/>
+        </w:numPr>
+        <w:rPr>
+          <w:sz w:val="24"/>
+          <w:szCs w:val="22"/>
+          <w:lang w:val="en-US"/>
+        </w:rPr>
+      </w:pPr>
+      <w:r>
+        <w:rPr>
+          <w:sz w:val="24"/>
+          <w:szCs w:val="22"/>
+          <w:lang w:val="en-US"/>
+        </w:rPr>
+        <w:t>Display all 8 menus</w:t>
+      </w:r>
+    </w:p>
+    <w:p>
+      <w:pPr>
+        <w:pStyle w:val="ListParagraph"/>
+        <w:numPr>
+          <w:ilvl w:val="0"/>
+          <w:numId w:val="1"/>
+        </w:numPr>
+        <w:spacing w:line="256" w:lineRule="auto"/>
+        <w:rPr>
+          <w:sz w:val="24"/>
+          <w:szCs w:val="24"/>
+          <w:lang w:val="en-US"/>
+        </w:rPr>
+      </w:pPr>
+      <w:r>
+        <w:rPr>
+          <w:sz w:val="24"/>
+          <w:szCs w:val="24"/>
+          <w:lang w:val="en-US"/>
+        </w:rPr>
+        <w:t xml:space="preserve">Open </w:t>
+      </w:r>
+      <w:hyperlink r:id="rId36" w:history="1">
+        <w:r>
+          <w:rPr>
+            <w:rStyle w:val="Hyperlink"/>
+            <w:sz w:val="24"/>
+            <w:szCs w:val="24"/>
+            <w:lang w:val="en-US"/>
+          </w:rPr>
+          <w:t>https://www.irctc.co.in/nget/profile/user-registration</w:t>
+        </w:r>
+      </w:hyperlink>
+    </w:p>
+    <w:p>
+      <w:pPr>
+        <w:pStyle w:val="ListParagraph"/>
+        <w:numPr>
+          <w:ilvl w:val="1"/>
+          <w:numId w:val="1"/>
+        </w:numPr>
+        <w:spacing w:line="256" w:lineRule="auto"/>
+        <w:rPr>
+          <w:sz w:val="24"/>
+          <w:szCs w:val="24"/>
+          <w:lang w:val="en-US"/>
+        </w:rPr>
+      </w:pPr>
+      <w:r>
+        <w:rPr>
+          <w:sz w:val="24"/>
+          <w:szCs w:val="24"/>
+          <w:lang w:val="en-US"/>
+        </w:rPr>
+        <w:t>Complete the registration process.</w:t>
+      </w:r>
+    </w:p>
+    <w:p>
+      <w:pPr>
+        <w:pStyle w:val="ListParagraph"/>
+        <w:numPr>
+          <w:ilvl w:val="1"/>
+          <w:numId w:val="1"/>
+        </w:numPr>
+        <w:spacing w:line="256" w:lineRule="auto"/>
+        <w:rPr>
+          <w:sz w:val="24"/>
+          <w:szCs w:val="24"/>
+          <w:lang w:val="en-US"/>
+        </w:rPr>
+      </w:pPr>
+      <w:r>
+        <w:rPr>
+          <w:sz w:val="24"/>
+          <w:szCs w:val="24"/>
+          <w:lang w:val="en-US"/>
+        </w:rPr>
+        <w:t>Display the messages after clicking on Submit button.</w:t>
+      </w:r>
+    </w:p>
+    <w:p>
+      <w:pPr>
+        <w:pStyle w:val="ListParagraph"/>
+        <w:numPr>
+          <w:ilvl w:val="0"/>
+          <w:numId w:val="1"/>
+        </w:numPr>
+        <w:rPr>
+          <w:sz w:val="24"/>
+          <w:szCs w:val="22"/>
+          <w:lang w:val="en-US"/>
+        </w:rPr>
+      </w:pPr>
+      <w:r>
+        <w:rPr>
+          <w:sz w:val="24"/>
+          <w:szCs w:val="22"/>
+          <w:lang w:val="en-US"/>
+        </w:rPr>
+        <w:t xml:space="preserve">Open </w:t>
+      </w:r>
+      <w:hyperlink r:id="rId37" w:history="1">
+        <w:r>
+          <w:rPr>
+            <w:rStyle w:val="Hyperlink"/>
+            <w:sz w:val="24"/>
+            <w:szCs w:val="22"/>
+            <w:lang w:val="en-US"/>
+          </w:rPr>
+          <w:t>https://testautomationpractice.blogspot.com/?m=1</w:t>
+        </w:r>
+      </w:hyperlink>
+    </w:p>
+    <w:p>
+      <w:pPr>
+        <w:pStyle w:val="ListParagraph"/>
+        <w:numPr>
+          <w:ilvl w:val="1"/>
+          <w:numId w:val="1"/>
+        </w:numPr>
+        <w:rPr>
+          <w:sz w:val="24"/>
+          <w:szCs w:val="22"/>
+          <w:lang w:val="en-US"/>
+        </w:rPr>
+      </w:pPr>
+      <w:r>
+        <w:rPr>
+          <w:sz w:val="24"/>
+          <w:szCs w:val="22"/>
+          <w:lang w:val="en-US"/>
+        </w:rPr>
+        <w:t>Double click on Copy Text button</w:t>
+      </w:r>
+    </w:p>
+    <w:p>
+      <w:pPr>
+        <w:pStyle w:val="ListParagraph"/>
+        <w:numPr>
+          <w:ilvl w:val="1"/>
+          <w:numId w:val="1"/>
+        </w:numPr>
+        <w:rPr>
+          <w:sz w:val="24"/>
+          <w:szCs w:val="22"/>
+          <w:lang w:val="en-US"/>
+        </w:rPr>
+      </w:pPr>
+      <w:r>
+        <w:rPr>
+          <w:sz w:val="24"/>
+          <w:szCs w:val="22"/>
+          <w:lang w:val="en-US"/>
+        </w:rPr>
+        <w:t>Make sure that the text from 1</w:t>
+      </w:r>
+      <w:r>
+        <w:rPr>
+          <w:sz w:val="24"/>
+          <w:szCs w:val="22"/>
+          <w:vertAlign w:val="superscript"/>
+          <w:lang w:val="en-US"/>
+        </w:rPr>
+        <w:t>st</w:t>
+      </w:r>
+      <w:r>
+        <w:rPr>
+          <w:sz w:val="24"/>
+          <w:szCs w:val="22"/>
+          <w:lang w:val="en-US"/>
+        </w:rPr>
+        <w:t xml:space="preserve"> text box is copied to the 2</w:t>
+      </w:r>
+      <w:r>
+        <w:rPr>
+          <w:sz w:val="24"/>
+          <w:szCs w:val="22"/>
+          <w:vertAlign w:val="superscript"/>
+          <w:lang w:val="en-US"/>
+        </w:rPr>
+        <w:t>nd</w:t>
+      </w:r>
+      <w:r>
+        <w:rPr>
+          <w:sz w:val="24"/>
+          <w:szCs w:val="22"/>
+          <w:lang w:val="en-US"/>
+        </w:rPr>
+        <w:t xml:space="preserve"> text box.</w:t>
+      </w:r>
+      <w:r>
+        <w:rPr>
+          <w:sz w:val="24"/>
+          <w:szCs w:val="22"/>
+          <w:lang w:val="en-US"/>
+        </w:rPr>
+        <w:br/>
+        <w:t>(Check the values / text from both text boxes that is equal or not)</w:t>
+      </w:r>
+    </w:p>
+    <w:p>
+      <w:pPr>
+        <w:pStyle w:val="ListParagraph"/>
+        <w:numPr>
+          <w:ilvl w:val="0"/>
+          <w:numId w:val="1"/>
+        </w:numPr>
+        <w:rPr>
+          <w:sz w:val="24"/>
+          <w:szCs w:val="22"/>
+          <w:lang w:val="en-US"/>
+        </w:rPr>
+      </w:pPr>
       <w:bookmarkStart w:id="0" w:name="_GoBack"/>
       <w:bookmarkEnd w:id="0"/>
-    </w:p>
-    <w:p>
-      <w:pPr>
-        <w:pStyle w:val="ListParagraph"/>
-        <w:numPr>
-          <w:ilvl w:val="1"/>
-          <w:numId w:val="1"/>
-        </w:numPr>
-        <w:rPr>
-          <w:sz w:val="24"/>
-          <w:szCs w:val="22"/>
-          <w:lang w:val="en-US"/>
-        </w:rPr>
-      </w:pPr>
     </w:p>
     <w:sectPr>
       <w:pgSz w:w="11906" w:h="16838"/>

</xml_diff>

<commit_message>
Date: 19 Jan 2026
</commit_message>
<xml_diff>
--- a/Assignments_SA2510014.docx
+++ b/Assignments_SA2510014.docx
@@ -5749,6 +5749,263 @@
         </w:rPr>
         <w:br/>
         <w:t>(Check the values / text from both text boxes that is equal or not)</w:t>
+      </w:r>
+    </w:p>
+    <w:p>
+      <w:pPr>
+        <w:rPr>
+          <w:sz w:val="24"/>
+          <w:szCs w:val="22"/>
+          <w:lang w:val="en-US"/>
+        </w:rPr>
+      </w:pPr>
+    </w:p>
+    <w:p>
+      <w:pPr>
+        <w:rPr>
+          <w:sz w:val="24"/>
+          <w:szCs w:val="22"/>
+          <w:lang w:val="en-US"/>
+        </w:rPr>
+      </w:pPr>
+      <w:r>
+        <w:rPr>
+          <w:sz w:val="24"/>
+          <w:szCs w:val="22"/>
+          <w:lang w:val="en-US"/>
+        </w:rPr>
+        <w:t>Date: 19 January 2026</w:t>
+      </w:r>
+    </w:p>
+    <w:p>
+      <w:pPr>
+        <w:rPr>
+          <w:sz w:val="24"/>
+          <w:szCs w:val="22"/>
+          <w:lang w:val="en-US"/>
+        </w:rPr>
+      </w:pPr>
+    </w:p>
+    <w:p>
+      <w:pPr>
+        <w:pStyle w:val="ListParagraph"/>
+        <w:numPr>
+          <w:ilvl w:val="0"/>
+          <w:numId w:val="1"/>
+        </w:numPr>
+        <w:spacing w:line="256" w:lineRule="auto"/>
+        <w:rPr>
+          <w:sz w:val="24"/>
+          <w:szCs w:val="24"/>
+          <w:lang w:val="en-US"/>
+        </w:rPr>
+      </w:pPr>
+      <w:r>
+        <w:rPr>
+          <w:sz w:val="24"/>
+          <w:szCs w:val="24"/>
+          <w:lang w:val="en-US"/>
+        </w:rPr>
+        <w:t xml:space="preserve">Open </w:t>
+      </w:r>
+      <w:hyperlink r:id="rId38" w:history="1">
+        <w:r>
+          <w:rPr>
+            <w:rStyle w:val="Hyperlink"/>
+            <w:sz w:val="24"/>
+            <w:szCs w:val="24"/>
+            <w:lang w:val="en-US"/>
+          </w:rPr>
+          <w:t>https://www.jotform.com/form-templates/exam-registration-form</w:t>
+        </w:r>
+      </w:hyperlink>
+    </w:p>
+    <w:p>
+      <w:pPr>
+        <w:pStyle w:val="ListParagraph"/>
+        <w:numPr>
+          <w:ilvl w:val="1"/>
+          <w:numId w:val="1"/>
+        </w:numPr>
+        <w:spacing w:line="256" w:lineRule="auto"/>
+        <w:rPr>
+          <w:sz w:val="24"/>
+          <w:szCs w:val="24"/>
+          <w:lang w:val="en-US"/>
+        </w:rPr>
+      </w:pPr>
+      <w:r>
+        <w:rPr>
+          <w:sz w:val="24"/>
+          <w:szCs w:val="24"/>
+          <w:lang w:val="en-US"/>
+        </w:rPr>
+        <w:t>Complete the registration process</w:t>
+      </w:r>
+    </w:p>
+    <w:p>
+      <w:pPr>
+        <w:pStyle w:val="ListParagraph"/>
+        <w:numPr>
+          <w:ilvl w:val="0"/>
+          <w:numId w:val="1"/>
+        </w:numPr>
+        <w:spacing w:line="254" w:lineRule="auto"/>
+        <w:rPr>
+          <w:sz w:val="24"/>
+          <w:szCs w:val="24"/>
+          <w:lang w:val="en-US"/>
+        </w:rPr>
+      </w:pPr>
+      <w:r>
+        <w:rPr>
+          <w:sz w:val="24"/>
+          <w:szCs w:val="24"/>
+          <w:lang w:val="en-US"/>
+        </w:rPr>
+        <w:t xml:space="preserve">Open </w:t>
+      </w:r>
+      <w:hyperlink r:id="rId39" w:history="1">
+        <w:r>
+          <w:rPr>
+            <w:rStyle w:val="Hyperlink"/>
+            <w:sz w:val="24"/>
+            <w:szCs w:val="24"/>
+            <w:lang w:val="en-US"/>
+          </w:rPr>
+          <w:t>https://www.nimblework.com/resources/?tx_post_tag=case-studies</w:t>
+        </w:r>
+      </w:hyperlink>
+      <w:r>
+        <w:rPr>
+          <w:sz w:val="24"/>
+          <w:szCs w:val="24"/>
+          <w:lang w:val="en-US"/>
+        </w:rPr>
+        <w:t xml:space="preserve"> </w:t>
+      </w:r>
+    </w:p>
+    <w:p>
+      <w:pPr>
+        <w:pStyle w:val="ListParagraph"/>
+        <w:numPr>
+          <w:ilvl w:val="1"/>
+          <w:numId w:val="1"/>
+        </w:numPr>
+        <w:spacing w:line="254" w:lineRule="auto"/>
+        <w:rPr>
+          <w:sz w:val="24"/>
+          <w:szCs w:val="24"/>
+          <w:lang w:val="en-US"/>
+        </w:rPr>
+      </w:pPr>
+      <w:r>
+        <w:rPr>
+          <w:sz w:val="24"/>
+          <w:szCs w:val="24"/>
+          <w:lang w:val="en-US"/>
+        </w:rPr>
+        <w:t>Click on The image of chat</w:t>
+      </w:r>
+    </w:p>
+    <w:p>
+      <w:pPr>
+        <w:pStyle w:val="ListParagraph"/>
+        <w:numPr>
+          <w:ilvl w:val="1"/>
+          <w:numId w:val="1"/>
+        </w:numPr>
+        <w:spacing w:line="254" w:lineRule="auto"/>
+        <w:rPr>
+          <w:sz w:val="24"/>
+          <w:szCs w:val="24"/>
+          <w:lang w:val="en-US"/>
+        </w:rPr>
+      </w:pPr>
+      <w:r>
+        <w:rPr>
+          <w:sz w:val="24"/>
+          <w:szCs w:val="24"/>
+          <w:lang w:val="en-US"/>
+        </w:rPr>
+        <w:t>Type Hello in the chat text box</w:t>
+      </w:r>
+    </w:p>
+    <w:p>
+      <w:pPr>
+        <w:pStyle w:val="ListParagraph"/>
+        <w:numPr>
+          <w:ilvl w:val="1"/>
+          <w:numId w:val="1"/>
+        </w:numPr>
+        <w:rPr>
+          <w:sz w:val="26"/>
+          <w:szCs w:val="24"/>
+          <w:lang w:val="en-US"/>
+        </w:rPr>
+      </w:pPr>
+      <w:r>
+        <w:rPr>
+          <w:sz w:val="24"/>
+          <w:szCs w:val="24"/>
+          <w:lang w:val="en-US"/>
+        </w:rPr>
+        <w:t>Hit Enter</w:t>
+      </w:r>
+    </w:p>
+    <w:p>
+      <w:pPr>
+        <w:pStyle w:val="ListParagraph"/>
+        <w:numPr>
+          <w:ilvl w:val="0"/>
+          <w:numId w:val="1"/>
+        </w:numPr>
+        <w:rPr>
+          <w:sz w:val="24"/>
+          <w:szCs w:val="22"/>
+          <w:lang w:val="en-US"/>
+        </w:rPr>
+      </w:pPr>
+      <w:r>
+        <w:rPr>
+          <w:sz w:val="24"/>
+          <w:szCs w:val="22"/>
+          <w:lang w:val="en-US"/>
+        </w:rPr>
+        <w:t xml:space="preserve">Complete the registration process on </w:t>
+      </w:r>
+      <w:hyperlink r:id="rId40" w:history="1">
+        <w:r>
+          <w:rPr>
+            <w:rStyle w:val="Hyperlink"/>
+            <w:sz w:val="24"/>
+            <w:szCs w:val="22"/>
+            <w:lang w:val="en-US"/>
+          </w:rPr>
+          <w:t>https://demoqa.com/automation-practice-form</w:t>
+        </w:r>
+      </w:hyperlink>
+    </w:p>
+    <w:p>
+      <w:pPr>
+        <w:pStyle w:val="ListParagraph"/>
+        <w:numPr>
+          <w:ilvl w:val="1"/>
+          <w:numId w:val="1"/>
+        </w:numPr>
+        <w:rPr>
+          <w:sz w:val="24"/>
+          <w:szCs w:val="22"/>
+          <w:lang w:val="en-US"/>
+        </w:rPr>
+      </w:pPr>
+      <w:r>
+        <w:rPr>
+          <w:sz w:val="24"/>
+          <w:szCs w:val="22"/>
+          <w:lang w:val="en-US"/>
+        </w:rPr>
+        <w:t>Display the table after clicking on Submit button</w:t>
       </w:r>
     </w:p>
     <w:p>

</xml_diff>

<commit_message>
Date: 20 Jan 2026
</commit_message>
<xml_diff>
--- a/Assignments_SA2510014.docx
+++ b/Assignments_SA2510014.docx
@@ -84,7 +84,6 @@
         </w:rPr>
         <w:t xml:space="preserve">What is the purpose and return type of method </w:t>
       </w:r>
-      <w:proofErr w:type="gramStart"/>
       <w:r>
         <w:rPr>
           <w:b/>
@@ -93,18 +92,7 @@
           <w:szCs w:val="22"/>
           <w:lang w:val="en-US"/>
         </w:rPr>
-        <w:t>getPageSource(</w:t>
-      </w:r>
-      <w:proofErr w:type="gramEnd"/>
-      <w:r>
-        <w:rPr>
-          <w:b/>
-          <w:bCs/>
-          <w:sz w:val="24"/>
-          <w:szCs w:val="22"/>
-          <w:lang w:val="en-US"/>
-        </w:rPr>
-        <w:t>)?</w:t>
+        <w:t>getPageSource()?</w:t>
       </w:r>
     </w:p>
     <w:p>
@@ -159,25 +147,7 @@
           <w:szCs w:val="22"/>
           <w:lang w:val="en-US"/>
         </w:rPr>
-        <w:t>Enter your name as user name (</w:t>
-      </w:r>
-      <w:proofErr w:type="spellStart"/>
-      <w:r>
-        <w:rPr>
-          <w:sz w:val="24"/>
-          <w:szCs w:val="22"/>
-          <w:lang w:val="en-US"/>
-        </w:rPr>
-        <w:t>abhinav</w:t>
-      </w:r>
-      <w:proofErr w:type="spellEnd"/>
-      <w:r>
-        <w:rPr>
-          <w:sz w:val="24"/>
-          <w:szCs w:val="22"/>
-          <w:lang w:val="en-US"/>
-        </w:rPr>
-        <w:t>)</w:t>
+        <w:t>Enter your name as user name (abhinav)</w:t>
       </w:r>
     </w:p>
     <w:p>
@@ -294,25 +264,7 @@
           <w:szCs w:val="22"/>
           <w:lang w:val="en-US"/>
         </w:rPr>
-        <w:t>Enter your name as user name (</w:t>
-      </w:r>
-      <w:proofErr w:type="spellStart"/>
-      <w:r>
-        <w:rPr>
-          <w:sz w:val="24"/>
-          <w:szCs w:val="22"/>
-          <w:lang w:val="en-US"/>
-        </w:rPr>
-        <w:t>abhinav</w:t>
-      </w:r>
-      <w:proofErr w:type="spellEnd"/>
-      <w:r>
-        <w:rPr>
-          <w:sz w:val="24"/>
-          <w:szCs w:val="22"/>
-          <w:lang w:val="en-US"/>
-        </w:rPr>
-        <w:t>)</w:t>
+        <w:t>Enter your name as user name (abhinav)</w:t>
       </w:r>
     </w:p>
     <w:p>
@@ -429,25 +381,7 @@
           <w:szCs w:val="22"/>
           <w:lang w:val="en-US"/>
         </w:rPr>
-        <w:t>Enter your name as user name (</w:t>
-      </w:r>
-      <w:proofErr w:type="spellStart"/>
-      <w:r>
-        <w:rPr>
-          <w:sz w:val="24"/>
-          <w:szCs w:val="22"/>
-          <w:lang w:val="en-US"/>
-        </w:rPr>
-        <w:t>abhinav</w:t>
-      </w:r>
-      <w:proofErr w:type="spellEnd"/>
-      <w:r>
-        <w:rPr>
-          <w:sz w:val="24"/>
-          <w:szCs w:val="22"/>
-          <w:lang w:val="en-US"/>
-        </w:rPr>
-        <w:t>)</w:t>
+        <w:t>Enter your name as user name (abhinav)</w:t>
       </w:r>
     </w:p>
     <w:p>
@@ -2077,25 +2011,7 @@
           <w:szCs w:val="24"/>
           <w:lang w:val="en-US"/>
         </w:rPr>
-        <w:t xml:space="preserve">Display the status of all 7 checkboxes (Monday, Tuesday </w:t>
-      </w:r>
-      <w:proofErr w:type="spellStart"/>
-      <w:r>
-        <w:rPr>
-          <w:sz w:val="24"/>
-          <w:szCs w:val="24"/>
-          <w:lang w:val="en-US"/>
-        </w:rPr>
-        <w:t>etc</w:t>
-      </w:r>
-      <w:proofErr w:type="spellEnd"/>
-      <w:r>
-        <w:rPr>
-          <w:sz w:val="24"/>
-          <w:szCs w:val="24"/>
-          <w:lang w:val="en-US"/>
-        </w:rPr>
-        <w:t>)</w:t>
+        <w:t>Display the status of all 7 checkboxes (Monday, Tuesday etc)</w:t>
       </w:r>
     </w:p>
     <w:p>
@@ -2534,7 +2450,6 @@
         </w:rPr>
         <w:br/>
       </w:r>
-      <w:proofErr w:type="spellStart"/>
       <w:r>
         <w:rPr>
           <w:rFonts w:ascii="Consolas" w:hAnsi="Consolas" w:cs="Consolas"/>
@@ -2567,9 +2482,18 @@
           <w:szCs w:val="28"/>
           <w:shd w:val="clear" w:color="auto" w:fill="E8F2FE"/>
         </w:rPr>
-        <w:t>.println</w:t>
-      </w:r>
-      <w:proofErr w:type="spellEnd"/>
+        <w:t>.println(</w:t>
+      </w:r>
+      <w:r>
+        <w:rPr>
+          <w:rFonts w:ascii="Consolas" w:hAnsi="Consolas" w:cs="Consolas"/>
+          <w:color w:val="2A00FF"/>
+          <w:sz w:val="28"/>
+          <w:szCs w:val="28"/>
+          <w:shd w:val="clear" w:color="auto" w:fill="E8F2FE"/>
+        </w:rPr>
+        <w:t>"My Birth Date: "</w:t>
+      </w:r>
       <w:r>
         <w:rPr>
           <w:rFonts w:ascii="Consolas" w:hAnsi="Consolas" w:cs="Consolas"/>
@@ -2578,29 +2502,8 @@
           <w:szCs w:val="28"/>
           <w:shd w:val="clear" w:color="auto" w:fill="E8F2FE"/>
         </w:rPr>
-        <w:t>(</w:t>
-      </w:r>
-      <w:r>
-        <w:rPr>
-          <w:rFonts w:ascii="Consolas" w:hAnsi="Consolas" w:cs="Consolas"/>
-          <w:color w:val="2A00FF"/>
-          <w:sz w:val="28"/>
-          <w:szCs w:val="28"/>
-          <w:shd w:val="clear" w:color="auto" w:fill="E8F2FE"/>
-        </w:rPr>
-        <w:t>"My Birth Date: "</w:t>
-      </w:r>
-      <w:r>
-        <w:rPr>
-          <w:rFonts w:ascii="Consolas" w:hAnsi="Consolas" w:cs="Consolas"/>
-          <w:color w:val="000000"/>
-          <w:sz w:val="28"/>
-          <w:szCs w:val="28"/>
-          <w:shd w:val="clear" w:color="auto" w:fill="E8F2FE"/>
-        </w:rPr>
         <w:t xml:space="preserve"> + </w:t>
       </w:r>
-      <w:proofErr w:type="spellStart"/>
       <w:r>
         <w:rPr>
           <w:rFonts w:ascii="Consolas" w:hAnsi="Consolas" w:cs="Consolas"/>
@@ -2620,9 +2523,18 @@
           <w:szCs w:val="28"/>
           <w:shd w:val="clear" w:color="auto" w:fill="E8F2FE"/>
         </w:rPr>
-        <w:t>.getFirstSelectedOption</w:t>
-      </w:r>
-      <w:proofErr w:type="spellEnd"/>
+        <w:t xml:space="preserve">.getFirstSelectedOption().getText() + </w:t>
+      </w:r>
+      <w:r>
+        <w:rPr>
+          <w:rFonts w:ascii="Consolas" w:hAnsi="Consolas" w:cs="Consolas"/>
+          <w:color w:val="2A00FF"/>
+          <w:sz w:val="28"/>
+          <w:szCs w:val="28"/>
+          <w:shd w:val="clear" w:color="auto" w:fill="E8F2FE"/>
+        </w:rPr>
+        <w:t>"-"</w:t>
+      </w:r>
       <w:r>
         <w:rPr>
           <w:rFonts w:ascii="Consolas" w:hAnsi="Consolas" w:cs="Consolas"/>
@@ -2631,29 +2543,8 @@
           <w:szCs w:val="28"/>
           <w:shd w:val="clear" w:color="auto" w:fill="E8F2FE"/>
         </w:rPr>
-        <w:t xml:space="preserve">().getText() + </w:t>
-      </w:r>
-      <w:r>
-        <w:rPr>
-          <w:rFonts w:ascii="Consolas" w:hAnsi="Consolas" w:cs="Consolas"/>
-          <w:color w:val="2A00FF"/>
-          <w:sz w:val="28"/>
-          <w:szCs w:val="28"/>
-          <w:shd w:val="clear" w:color="auto" w:fill="E8F2FE"/>
-        </w:rPr>
-        <w:t>"-"</w:t>
-      </w:r>
-      <w:r>
-        <w:rPr>
-          <w:rFonts w:ascii="Consolas" w:hAnsi="Consolas" w:cs="Consolas"/>
-          <w:color w:val="000000"/>
-          <w:sz w:val="28"/>
-          <w:szCs w:val="28"/>
-          <w:shd w:val="clear" w:color="auto" w:fill="E8F2FE"/>
-        </w:rPr>
         <w:t xml:space="preserve"> + </w:t>
       </w:r>
-      <w:proofErr w:type="spellStart"/>
       <w:r>
         <w:rPr>
           <w:rFonts w:ascii="Consolas" w:hAnsi="Consolas" w:cs="Consolas"/>
@@ -2673,9 +2564,18 @@
           <w:szCs w:val="28"/>
           <w:shd w:val="clear" w:color="auto" w:fill="E8F2FE"/>
         </w:rPr>
-        <w:t>.getFirstSelectedOption</w:t>
-      </w:r>
-      <w:proofErr w:type="spellEnd"/>
+        <w:t xml:space="preserve">.getFirstSelectedOption().getText() + </w:t>
+      </w:r>
+      <w:r>
+        <w:rPr>
+          <w:rFonts w:ascii="Consolas" w:hAnsi="Consolas" w:cs="Consolas"/>
+          <w:color w:val="2A00FF"/>
+          <w:sz w:val="28"/>
+          <w:szCs w:val="28"/>
+          <w:shd w:val="clear" w:color="auto" w:fill="E8F2FE"/>
+        </w:rPr>
+        <w:t>"-"</w:t>
+      </w:r>
       <w:r>
         <w:rPr>
           <w:rFonts w:ascii="Consolas" w:hAnsi="Consolas" w:cs="Consolas"/>
@@ -2684,29 +2584,8 @@
           <w:szCs w:val="28"/>
           <w:shd w:val="clear" w:color="auto" w:fill="E8F2FE"/>
         </w:rPr>
-        <w:t xml:space="preserve">().getText() + </w:t>
-      </w:r>
-      <w:r>
-        <w:rPr>
-          <w:rFonts w:ascii="Consolas" w:hAnsi="Consolas" w:cs="Consolas"/>
-          <w:color w:val="2A00FF"/>
-          <w:sz w:val="28"/>
-          <w:szCs w:val="28"/>
-          <w:shd w:val="clear" w:color="auto" w:fill="E8F2FE"/>
-        </w:rPr>
-        <w:t>"-"</w:t>
-      </w:r>
-      <w:r>
-        <w:rPr>
-          <w:rFonts w:ascii="Consolas" w:hAnsi="Consolas" w:cs="Consolas"/>
-          <w:color w:val="000000"/>
-          <w:sz w:val="28"/>
-          <w:szCs w:val="28"/>
-          <w:shd w:val="clear" w:color="auto" w:fill="E8F2FE"/>
-        </w:rPr>
         <w:t xml:space="preserve"> + </w:t>
       </w:r>
-      <w:proofErr w:type="spellStart"/>
       <w:r>
         <w:rPr>
           <w:rFonts w:ascii="Consolas" w:hAnsi="Consolas" w:cs="Consolas"/>
@@ -2726,18 +2605,7 @@
           <w:szCs w:val="28"/>
           <w:shd w:val="clear" w:color="auto" w:fill="E8F2FE"/>
         </w:rPr>
-        <w:t>.getFirstSelectedOption</w:t>
-      </w:r>
-      <w:proofErr w:type="spellEnd"/>
-      <w:r>
-        <w:rPr>
-          <w:rFonts w:ascii="Consolas" w:hAnsi="Consolas" w:cs="Consolas"/>
-          <w:color w:val="000000"/>
-          <w:sz w:val="28"/>
-          <w:szCs w:val="28"/>
-          <w:shd w:val="clear" w:color="auto" w:fill="E8F2FE"/>
-        </w:rPr>
-        <w:t>().getText());</w:t>
+        <w:t>.getFirstSelectedOption().getText());</w:t>
       </w:r>
     </w:p>
     <w:p>
@@ -3182,27 +3050,7 @@
           <w:highlight w:val="yellow"/>
           <w:lang w:val="en-US"/>
         </w:rPr>
-        <w:t xml:space="preserve">Enter first 4 characters from your city (Kolhapur – </w:t>
-      </w:r>
-      <w:proofErr w:type="spellStart"/>
-      <w:r>
-        <w:rPr>
-          <w:sz w:val="24"/>
-          <w:szCs w:val="24"/>
-          <w:highlight w:val="yellow"/>
-          <w:lang w:val="en-US"/>
-        </w:rPr>
-        <w:t>kolh</w:t>
-      </w:r>
-      <w:proofErr w:type="spellEnd"/>
-      <w:r>
-        <w:rPr>
-          <w:sz w:val="24"/>
-          <w:szCs w:val="24"/>
-          <w:highlight w:val="yellow"/>
-          <w:lang w:val="en-US"/>
-        </w:rPr>
-        <w:t>)</w:t>
+        <w:t>Enter first 4 characters from your city (Kolhapur – kolh)</w:t>
       </w:r>
     </w:p>
     <w:p>
@@ -4231,19 +4079,8 @@
           <w:highlight w:val="yellow"/>
           <w:lang w:val="en-US"/>
         </w:rPr>
-        <w:t xml:space="preserve">Login using data provided in step no h &amp; </w:t>
-      </w:r>
-      <w:proofErr w:type="spellStart"/>
-      <w:r>
-        <w:rPr>
-          <w:sz w:val="24"/>
-          <w:szCs w:val="24"/>
-          <w:highlight w:val="yellow"/>
-          <w:lang w:val="en-US"/>
-        </w:rPr>
-        <w:t>i</w:t>
-      </w:r>
-      <w:proofErr w:type="spellEnd"/>
+        <w:t>Login using data provided in step no h &amp; i</w:t>
+      </w:r>
     </w:p>
     <w:p>
       <w:pPr>
@@ -5042,25 +4879,7 @@
           <w:szCs w:val="24"/>
           <w:lang w:val="en-US"/>
         </w:rPr>
-        <w:t xml:space="preserve">Click on </w:t>
-      </w:r>
-      <w:proofErr w:type="spellStart"/>
-      <w:r>
-        <w:rPr>
-          <w:sz w:val="24"/>
-          <w:szCs w:val="24"/>
-          <w:lang w:val="en-US"/>
-        </w:rPr>
-        <w:t>ClickToGetAlert</w:t>
-      </w:r>
-      <w:proofErr w:type="spellEnd"/>
-      <w:r>
-        <w:rPr>
-          <w:sz w:val="24"/>
-          <w:szCs w:val="24"/>
-          <w:lang w:val="en-US"/>
-        </w:rPr>
-        <w:t xml:space="preserve"> button</w:t>
+        <w:t>Click on ClickToGetAlert button</w:t>
       </w:r>
     </w:p>
     <w:p>
@@ -5129,25 +4948,7 @@
           <w:szCs w:val="24"/>
           <w:lang w:val="en-US"/>
         </w:rPr>
-        <w:t xml:space="preserve">Click on </w:t>
-      </w:r>
-      <w:proofErr w:type="spellStart"/>
-      <w:r>
-        <w:rPr>
-          <w:sz w:val="24"/>
-          <w:szCs w:val="24"/>
-          <w:lang w:val="en-US"/>
-        </w:rPr>
-        <w:t>GetPrompt</w:t>
-      </w:r>
-      <w:proofErr w:type="spellEnd"/>
-      <w:r>
-        <w:rPr>
-          <w:sz w:val="24"/>
-          <w:szCs w:val="24"/>
-          <w:lang w:val="en-US"/>
-        </w:rPr>
-        <w:t xml:space="preserve"> Button</w:t>
+        <w:t>Click on GetPrompt Button</w:t>
       </w:r>
     </w:p>
     <w:p>
@@ -5216,25 +5017,7 @@
           <w:szCs w:val="24"/>
           <w:lang w:val="en-US"/>
         </w:rPr>
-        <w:t xml:space="preserve">Click on </w:t>
-      </w:r>
-      <w:proofErr w:type="spellStart"/>
-      <w:r>
-        <w:rPr>
-          <w:sz w:val="24"/>
-          <w:szCs w:val="24"/>
-          <w:lang w:val="en-US"/>
-        </w:rPr>
-        <w:t>GetConfirmation</w:t>
-      </w:r>
-      <w:proofErr w:type="spellEnd"/>
-      <w:r>
-        <w:rPr>
-          <w:sz w:val="24"/>
-          <w:szCs w:val="24"/>
-          <w:lang w:val="en-US"/>
-        </w:rPr>
-        <w:t xml:space="preserve"> Button </w:t>
+        <w:t xml:space="preserve">Click on GetConfirmation Button </w:t>
       </w:r>
     </w:p>
     <w:p>
@@ -6010,19 +5793,720 @@
     </w:p>
     <w:p>
       <w:pPr>
+        <w:rPr>
+          <w:sz w:val="24"/>
+          <w:szCs w:val="22"/>
+          <w:lang w:val="en-US"/>
+        </w:rPr>
+      </w:pPr>
+    </w:p>
+    <w:p>
+      <w:pPr>
+        <w:rPr>
+          <w:b/>
+          <w:bCs/>
+          <w:sz w:val="24"/>
+          <w:szCs w:val="22"/>
+          <w:lang w:val="en-US"/>
+        </w:rPr>
+      </w:pPr>
+      <w:r>
+        <w:rPr>
+          <w:b/>
+          <w:bCs/>
+          <w:sz w:val="24"/>
+          <w:szCs w:val="22"/>
+          <w:lang w:val="en-US"/>
+        </w:rPr>
+        <w:t>Additional Assignment</w:t>
+      </w:r>
+    </w:p>
+    <w:p>
+      <w:pPr>
+        <w:rPr>
+          <w:sz w:val="24"/>
+          <w:szCs w:val="22"/>
+          <w:lang w:val="en-US"/>
+        </w:rPr>
+      </w:pPr>
+      <w:r>
+        <w:rPr>
+          <w:sz w:val="24"/>
+          <w:szCs w:val="22"/>
+          <w:lang w:val="en-US"/>
+        </w:rPr>
+        <w:t>Try solving 26 assignments / test cases on</w:t>
+      </w:r>
+    </w:p>
+    <w:p>
+      <w:pPr>
+        <w:rPr>
+          <w:sz w:val="24"/>
+          <w:szCs w:val="22"/>
+          <w:lang w:val="en-US"/>
+        </w:rPr>
+      </w:pPr>
+      <w:hyperlink r:id="rId41" w:history="1">
+        <w:r>
+          <w:rPr>
+            <w:rStyle w:val="Hyperlink"/>
+            <w:sz w:val="24"/>
+            <w:szCs w:val="22"/>
+            <w:lang w:val="en-US"/>
+          </w:rPr>
+          <w:t>https://automationexercise.com/</w:t>
+        </w:r>
+      </w:hyperlink>
+    </w:p>
+    <w:p>
+      <w:pPr>
+        <w:rPr>
+          <w:sz w:val="24"/>
+          <w:szCs w:val="22"/>
+          <w:lang w:val="en-US"/>
+        </w:rPr>
+      </w:pPr>
+      <w:r>
+        <w:rPr>
+          <w:sz w:val="24"/>
+          <w:szCs w:val="22"/>
+          <w:lang w:val="en-US"/>
+        </w:rPr>
+        <w:br w:type="page"/>
+      </w:r>
+    </w:p>
+    <w:p>
+      <w:pPr>
+        <w:rPr>
+          <w:b/>
+          <w:bCs/>
+          <w:sz w:val="24"/>
+          <w:szCs w:val="22"/>
+          <w:lang w:val="en-US"/>
+        </w:rPr>
+      </w:pPr>
+      <w:r>
+        <w:rPr>
+          <w:b/>
+          <w:bCs/>
+          <w:sz w:val="24"/>
+          <w:szCs w:val="22"/>
+          <w:lang w:val="en-US"/>
+        </w:rPr>
+        <w:lastRenderedPageBreak/>
+        <w:t>TestNG Assignment</w:t>
+      </w:r>
+    </w:p>
+    <w:p>
+      <w:pPr>
         <w:pStyle w:val="ListParagraph"/>
         <w:numPr>
           <w:ilvl w:val="0"/>
-          <w:numId w:val="1"/>
-        </w:numPr>
-        <w:rPr>
-          <w:sz w:val="24"/>
-          <w:szCs w:val="22"/>
-          <w:lang w:val="en-US"/>
-        </w:rPr>
-      </w:pPr>
+          <w:numId w:val="6"/>
+        </w:numPr>
+        <w:rPr>
+          <w:sz w:val="24"/>
+          <w:szCs w:val="22"/>
+          <w:highlight w:val="yellow"/>
+          <w:lang w:val="en-US"/>
+        </w:rPr>
+      </w:pPr>
+      <w:r>
+        <w:rPr>
+          <w:sz w:val="24"/>
+          <w:szCs w:val="22"/>
+          <w:highlight w:val="yellow"/>
+          <w:lang w:val="en-US"/>
+        </w:rPr>
+        <w:t>Assignment to understand working of BeforeTest, AfterTest, BeforeMethod and AfterMethod</w:t>
+      </w:r>
+    </w:p>
+    <w:p>
+      <w:pPr>
+        <w:pStyle w:val="ListParagraph"/>
+        <w:numPr>
+          <w:ilvl w:val="1"/>
+          <w:numId w:val="6"/>
+        </w:numPr>
+        <w:rPr>
+          <w:sz w:val="24"/>
+          <w:szCs w:val="22"/>
+          <w:highlight w:val="yellow"/>
+          <w:lang w:val="en-US"/>
+        </w:rPr>
+      </w:pPr>
+      <w:r>
+        <w:rPr>
+          <w:sz w:val="24"/>
+          <w:szCs w:val="22"/>
+          <w:highlight w:val="yellow"/>
+          <w:lang w:val="en-US"/>
+        </w:rPr>
+        <w:t>Open Browser</w:t>
+      </w:r>
+      <w:r>
+        <w:rPr>
+          <w:sz w:val="24"/>
+          <w:szCs w:val="22"/>
+          <w:highlight w:val="yellow"/>
+          <w:lang w:val="en-US"/>
+        </w:rPr>
+        <w:br/>
+      </w:r>
+    </w:p>
+    <w:p>
+      <w:pPr>
+        <w:pStyle w:val="ListParagraph"/>
+        <w:numPr>
+          <w:ilvl w:val="1"/>
+          <w:numId w:val="6"/>
+        </w:numPr>
+        <w:rPr>
+          <w:sz w:val="24"/>
+          <w:szCs w:val="22"/>
+          <w:highlight w:val="yellow"/>
+          <w:lang w:val="en-US"/>
+        </w:rPr>
+      </w:pPr>
+      <w:r>
+        <w:rPr>
+          <w:sz w:val="24"/>
+          <w:szCs w:val="22"/>
+          <w:highlight w:val="yellow"/>
+          <w:lang w:val="en-US"/>
+        </w:rPr>
+        <w:t xml:space="preserve">Open </w:t>
+      </w:r>
+      <w:hyperlink r:id="rId42" w:history="1">
+        <w:r>
+          <w:rPr>
+            <w:rStyle w:val="Hyperlink"/>
+            <w:sz w:val="24"/>
+            <w:szCs w:val="22"/>
+            <w:highlight w:val="yellow"/>
+            <w:lang w:val="en-US"/>
+          </w:rPr>
+          <w:t>https://www.selenium.dev/</w:t>
+        </w:r>
+      </w:hyperlink>
+    </w:p>
+    <w:p>
+      <w:pPr>
+        <w:pStyle w:val="ListParagraph"/>
+        <w:numPr>
+          <w:ilvl w:val="1"/>
+          <w:numId w:val="6"/>
+        </w:numPr>
+        <w:rPr>
+          <w:sz w:val="24"/>
+          <w:szCs w:val="22"/>
+          <w:highlight w:val="yellow"/>
+          <w:lang w:val="en-US"/>
+        </w:rPr>
+      </w:pPr>
+      <w:r>
+        <w:rPr>
+          <w:sz w:val="24"/>
+          <w:szCs w:val="22"/>
+          <w:highlight w:val="yellow"/>
+          <w:lang w:val="en-US"/>
+        </w:rPr>
+        <w:t>Print the title</w:t>
+      </w:r>
+    </w:p>
+    <w:p>
+      <w:pPr>
+        <w:pStyle w:val="ListParagraph"/>
+        <w:numPr>
+          <w:ilvl w:val="1"/>
+          <w:numId w:val="6"/>
+        </w:numPr>
+        <w:rPr>
+          <w:b/>
+          <w:bCs/>
+          <w:sz w:val="24"/>
+          <w:szCs w:val="22"/>
+          <w:highlight w:val="yellow"/>
+          <w:lang w:val="en-US"/>
+        </w:rPr>
+      </w:pPr>
+      <w:r>
+        <w:rPr>
+          <w:b/>
+          <w:bCs/>
+          <w:sz w:val="24"/>
+          <w:szCs w:val="22"/>
+          <w:highlight w:val="yellow"/>
+          <w:lang w:val="en-US"/>
+        </w:rPr>
+        <w:t>Click on Downloads</w:t>
+      </w:r>
+    </w:p>
+    <w:p>
+      <w:pPr>
+        <w:pStyle w:val="ListParagraph"/>
+        <w:numPr>
+          <w:ilvl w:val="1"/>
+          <w:numId w:val="6"/>
+        </w:numPr>
+        <w:rPr>
+          <w:sz w:val="24"/>
+          <w:szCs w:val="22"/>
+          <w:highlight w:val="yellow"/>
+          <w:lang w:val="en-US"/>
+        </w:rPr>
+      </w:pPr>
+      <w:r>
+        <w:rPr>
+          <w:sz w:val="24"/>
+          <w:szCs w:val="22"/>
+          <w:highlight w:val="yellow"/>
+          <w:lang w:val="en-US"/>
+        </w:rPr>
+        <w:t>Print the title</w:t>
+      </w:r>
+      <w:r>
+        <w:rPr>
+          <w:sz w:val="24"/>
+          <w:szCs w:val="22"/>
+          <w:highlight w:val="yellow"/>
+          <w:lang w:val="en-US"/>
+        </w:rPr>
+        <w:br/>
+      </w:r>
+    </w:p>
+    <w:p>
+      <w:pPr>
+        <w:pStyle w:val="ListParagraph"/>
+        <w:numPr>
+          <w:ilvl w:val="1"/>
+          <w:numId w:val="6"/>
+        </w:numPr>
+        <w:rPr>
+          <w:sz w:val="24"/>
+          <w:szCs w:val="22"/>
+          <w:highlight w:val="yellow"/>
+          <w:lang w:val="en-US"/>
+        </w:rPr>
+      </w:pPr>
+      <w:r>
+        <w:rPr>
+          <w:sz w:val="24"/>
+          <w:szCs w:val="22"/>
+          <w:highlight w:val="yellow"/>
+          <w:lang w:val="en-US"/>
+        </w:rPr>
+        <w:t xml:space="preserve">Open </w:t>
+      </w:r>
+      <w:hyperlink r:id="rId43" w:history="1">
+        <w:r>
+          <w:rPr>
+            <w:rStyle w:val="Hyperlink"/>
+            <w:sz w:val="24"/>
+            <w:szCs w:val="22"/>
+            <w:highlight w:val="yellow"/>
+            <w:lang w:val="en-US"/>
+          </w:rPr>
+          <w:t>https://www.selenium.dev/</w:t>
+        </w:r>
+      </w:hyperlink>
+    </w:p>
+    <w:p>
+      <w:pPr>
+        <w:pStyle w:val="ListParagraph"/>
+        <w:numPr>
+          <w:ilvl w:val="1"/>
+          <w:numId w:val="6"/>
+        </w:numPr>
+        <w:rPr>
+          <w:sz w:val="24"/>
+          <w:szCs w:val="22"/>
+          <w:highlight w:val="yellow"/>
+          <w:lang w:val="en-US"/>
+        </w:rPr>
+      </w:pPr>
+      <w:r>
+        <w:rPr>
+          <w:sz w:val="24"/>
+          <w:szCs w:val="22"/>
+          <w:highlight w:val="yellow"/>
+          <w:lang w:val="en-US"/>
+        </w:rPr>
+        <w:t>Print the title</w:t>
+      </w:r>
+    </w:p>
+    <w:p>
+      <w:pPr>
+        <w:pStyle w:val="ListParagraph"/>
+        <w:numPr>
+          <w:ilvl w:val="1"/>
+          <w:numId w:val="6"/>
+        </w:numPr>
+        <w:rPr>
+          <w:b/>
+          <w:bCs/>
+          <w:sz w:val="24"/>
+          <w:szCs w:val="22"/>
+          <w:highlight w:val="yellow"/>
+          <w:lang w:val="en-US"/>
+        </w:rPr>
+      </w:pPr>
+      <w:r>
+        <w:rPr>
+          <w:b/>
+          <w:bCs/>
+          <w:sz w:val="24"/>
+          <w:szCs w:val="22"/>
+          <w:highlight w:val="yellow"/>
+          <w:lang w:val="en-US"/>
+        </w:rPr>
+        <w:t xml:space="preserve">Click on </w:t>
+      </w:r>
+      <w:r>
+        <w:rPr>
+          <w:b/>
+          <w:bCs/>
+          <w:sz w:val="24"/>
+          <w:szCs w:val="22"/>
+          <w:highlight w:val="yellow"/>
+          <w:lang w:val="en-US"/>
+        </w:rPr>
+        <w:t>Documentation</w:t>
+      </w:r>
+    </w:p>
+    <w:p>
+      <w:pPr>
+        <w:pStyle w:val="ListParagraph"/>
+        <w:numPr>
+          <w:ilvl w:val="1"/>
+          <w:numId w:val="6"/>
+        </w:numPr>
+        <w:rPr>
+          <w:sz w:val="24"/>
+          <w:szCs w:val="22"/>
+          <w:highlight w:val="yellow"/>
+          <w:lang w:val="en-US"/>
+        </w:rPr>
+      </w:pPr>
+      <w:r>
+        <w:rPr>
+          <w:sz w:val="24"/>
+          <w:szCs w:val="22"/>
+          <w:highlight w:val="yellow"/>
+          <w:lang w:val="en-US"/>
+        </w:rPr>
+        <w:t>Print the title</w:t>
+      </w:r>
+      <w:r>
+        <w:rPr>
+          <w:sz w:val="24"/>
+          <w:szCs w:val="22"/>
+          <w:highlight w:val="yellow"/>
+          <w:lang w:val="en-US"/>
+        </w:rPr>
+        <w:br/>
+      </w:r>
+    </w:p>
+    <w:p>
+      <w:pPr>
+        <w:pStyle w:val="ListParagraph"/>
+        <w:numPr>
+          <w:ilvl w:val="1"/>
+          <w:numId w:val="6"/>
+        </w:numPr>
+        <w:rPr>
+          <w:sz w:val="24"/>
+          <w:szCs w:val="22"/>
+          <w:highlight w:val="yellow"/>
+          <w:lang w:val="en-US"/>
+        </w:rPr>
+      </w:pPr>
+      <w:r>
+        <w:rPr>
+          <w:sz w:val="24"/>
+          <w:szCs w:val="22"/>
+          <w:highlight w:val="yellow"/>
+          <w:lang w:val="en-US"/>
+        </w:rPr>
+        <w:t xml:space="preserve">Open </w:t>
+      </w:r>
+      <w:hyperlink r:id="rId44" w:history="1">
+        <w:r>
+          <w:rPr>
+            <w:rStyle w:val="Hyperlink"/>
+            <w:sz w:val="24"/>
+            <w:szCs w:val="22"/>
+            <w:highlight w:val="yellow"/>
+            <w:lang w:val="en-US"/>
+          </w:rPr>
+          <w:t>https://www.selenium.dev/</w:t>
+        </w:r>
+      </w:hyperlink>
+    </w:p>
+    <w:p>
+      <w:pPr>
+        <w:pStyle w:val="ListParagraph"/>
+        <w:numPr>
+          <w:ilvl w:val="1"/>
+          <w:numId w:val="6"/>
+        </w:numPr>
+        <w:rPr>
+          <w:sz w:val="24"/>
+          <w:szCs w:val="22"/>
+          <w:highlight w:val="yellow"/>
+          <w:lang w:val="en-US"/>
+        </w:rPr>
+      </w:pPr>
+      <w:r>
+        <w:rPr>
+          <w:sz w:val="24"/>
+          <w:szCs w:val="22"/>
+          <w:highlight w:val="yellow"/>
+          <w:lang w:val="en-US"/>
+        </w:rPr>
+        <w:t>Print the title</w:t>
+      </w:r>
+    </w:p>
+    <w:p>
+      <w:pPr>
+        <w:pStyle w:val="ListParagraph"/>
+        <w:numPr>
+          <w:ilvl w:val="1"/>
+          <w:numId w:val="6"/>
+        </w:numPr>
+        <w:rPr>
+          <w:b/>
+          <w:bCs/>
+          <w:sz w:val="24"/>
+          <w:szCs w:val="22"/>
+          <w:highlight w:val="yellow"/>
+          <w:lang w:val="en-US"/>
+        </w:rPr>
+      </w:pPr>
+      <w:r>
+        <w:rPr>
+          <w:b/>
+          <w:bCs/>
+          <w:sz w:val="24"/>
+          <w:szCs w:val="22"/>
+          <w:highlight w:val="yellow"/>
+          <w:lang w:val="en-US"/>
+        </w:rPr>
+        <w:t xml:space="preserve">Click on </w:t>
+      </w:r>
+      <w:r>
+        <w:rPr>
+          <w:b/>
+          <w:bCs/>
+          <w:sz w:val="24"/>
+          <w:szCs w:val="22"/>
+          <w:highlight w:val="yellow"/>
+          <w:lang w:val="en-US"/>
+        </w:rPr>
+        <w:t>Projects</w:t>
+      </w:r>
+    </w:p>
+    <w:p>
+      <w:pPr>
+        <w:pStyle w:val="ListParagraph"/>
+        <w:numPr>
+          <w:ilvl w:val="1"/>
+          <w:numId w:val="6"/>
+        </w:numPr>
+        <w:rPr>
+          <w:sz w:val="24"/>
+          <w:szCs w:val="22"/>
+          <w:highlight w:val="yellow"/>
+          <w:lang w:val="en-US"/>
+        </w:rPr>
+      </w:pPr>
+      <w:r>
+        <w:rPr>
+          <w:sz w:val="24"/>
+          <w:szCs w:val="22"/>
+          <w:highlight w:val="yellow"/>
+          <w:lang w:val="en-US"/>
+        </w:rPr>
+        <w:t>Print the title</w:t>
+      </w:r>
+      <w:r>
+        <w:rPr>
+          <w:sz w:val="24"/>
+          <w:szCs w:val="22"/>
+          <w:highlight w:val="yellow"/>
+          <w:lang w:val="en-US"/>
+        </w:rPr>
+        <w:br/>
+      </w:r>
+    </w:p>
+    <w:p>
+      <w:pPr>
+        <w:pStyle w:val="ListParagraph"/>
+        <w:numPr>
+          <w:ilvl w:val="1"/>
+          <w:numId w:val="6"/>
+        </w:numPr>
+        <w:rPr>
+          <w:sz w:val="24"/>
+          <w:szCs w:val="22"/>
+          <w:highlight w:val="yellow"/>
+          <w:lang w:val="en-US"/>
+        </w:rPr>
+      </w:pPr>
+      <w:r>
+        <w:rPr>
+          <w:sz w:val="24"/>
+          <w:szCs w:val="22"/>
+          <w:highlight w:val="yellow"/>
+          <w:lang w:val="en-US"/>
+        </w:rPr>
+        <w:t xml:space="preserve">Open </w:t>
+      </w:r>
+      <w:hyperlink r:id="rId45" w:history="1">
+        <w:r>
+          <w:rPr>
+            <w:rStyle w:val="Hyperlink"/>
+            <w:sz w:val="24"/>
+            <w:szCs w:val="22"/>
+            <w:highlight w:val="yellow"/>
+            <w:lang w:val="en-US"/>
+          </w:rPr>
+          <w:t>https://www.selenium.dev/</w:t>
+        </w:r>
+      </w:hyperlink>
+    </w:p>
+    <w:p>
+      <w:pPr>
+        <w:pStyle w:val="ListParagraph"/>
+        <w:numPr>
+          <w:ilvl w:val="1"/>
+          <w:numId w:val="6"/>
+        </w:numPr>
+        <w:rPr>
+          <w:sz w:val="24"/>
+          <w:szCs w:val="22"/>
+          <w:highlight w:val="yellow"/>
+          <w:lang w:val="en-US"/>
+        </w:rPr>
+      </w:pPr>
+      <w:r>
+        <w:rPr>
+          <w:sz w:val="24"/>
+          <w:szCs w:val="22"/>
+          <w:highlight w:val="yellow"/>
+          <w:lang w:val="en-US"/>
+        </w:rPr>
+        <w:t>Print the title</w:t>
+      </w:r>
+    </w:p>
+    <w:p>
+      <w:pPr>
+        <w:pStyle w:val="ListParagraph"/>
+        <w:numPr>
+          <w:ilvl w:val="1"/>
+          <w:numId w:val="6"/>
+        </w:numPr>
+        <w:rPr>
+          <w:b/>
+          <w:bCs/>
+          <w:sz w:val="24"/>
+          <w:szCs w:val="22"/>
+          <w:highlight w:val="yellow"/>
+          <w:lang w:val="en-US"/>
+        </w:rPr>
+      </w:pPr>
+      <w:r>
+        <w:rPr>
+          <w:b/>
+          <w:bCs/>
+          <w:sz w:val="24"/>
+          <w:szCs w:val="22"/>
+          <w:highlight w:val="yellow"/>
+          <w:lang w:val="en-US"/>
+        </w:rPr>
+        <w:t xml:space="preserve">Click on </w:t>
+      </w:r>
+      <w:r>
+        <w:rPr>
+          <w:b/>
+          <w:bCs/>
+          <w:sz w:val="24"/>
+          <w:szCs w:val="22"/>
+          <w:highlight w:val="yellow"/>
+          <w:lang w:val="en-US"/>
+        </w:rPr>
+        <w:t>Support</w:t>
+      </w:r>
+    </w:p>
+    <w:p>
+      <w:pPr>
+        <w:pStyle w:val="ListParagraph"/>
+        <w:numPr>
+          <w:ilvl w:val="1"/>
+          <w:numId w:val="6"/>
+        </w:numPr>
+        <w:rPr>
+          <w:sz w:val="24"/>
+          <w:szCs w:val="22"/>
+          <w:highlight w:val="yellow"/>
+          <w:lang w:val="en-US"/>
+        </w:rPr>
+      </w:pPr>
+      <w:r>
+        <w:rPr>
+          <w:sz w:val="24"/>
+          <w:szCs w:val="22"/>
+          <w:highlight w:val="yellow"/>
+          <w:lang w:val="en-US"/>
+        </w:rPr>
+        <w:t>Print the title</w:t>
+      </w:r>
+      <w:r>
+        <w:rPr>
+          <w:sz w:val="24"/>
+          <w:szCs w:val="22"/>
+          <w:highlight w:val="yellow"/>
+          <w:lang w:val="en-US"/>
+        </w:rPr>
+        <w:br/>
+      </w:r>
       <w:bookmarkStart w:id="0" w:name="_GoBack"/>
       <w:bookmarkEnd w:id="0"/>
+    </w:p>
+    <w:p>
+      <w:pPr>
+        <w:pStyle w:val="ListParagraph"/>
+        <w:numPr>
+          <w:ilvl w:val="1"/>
+          <w:numId w:val="6"/>
+        </w:numPr>
+        <w:rPr>
+          <w:sz w:val="24"/>
+          <w:szCs w:val="22"/>
+          <w:highlight w:val="yellow"/>
+          <w:lang w:val="en-US"/>
+        </w:rPr>
+      </w:pPr>
+      <w:r>
+        <w:rPr>
+          <w:sz w:val="24"/>
+          <w:szCs w:val="22"/>
+          <w:highlight w:val="yellow"/>
+          <w:lang w:val="en-US"/>
+        </w:rPr>
+        <w:t>Close Browser</w:t>
+      </w:r>
+    </w:p>
+    <w:p>
+      <w:pPr>
+        <w:pStyle w:val="ListParagraph"/>
+        <w:ind w:left="1440"/>
+        <w:rPr>
+          <w:sz w:val="24"/>
+          <w:szCs w:val="22"/>
+          <w:lang w:val="en-US"/>
+        </w:rPr>
+      </w:pPr>
     </w:p>
     <w:sectPr>
       <w:pgSz w:w="11906" w:h="16838"/>
@@ -6126,9 +6610,9 @@
     </w:lvl>
   </w:abstractNum>
   <w:abstractNum w:abstractNumId="1">
-    <w:nsid w:val="4A590F86"/>
+    <w:nsid w:val="1D1C626E"/>
     <w:multiLevelType w:val="hybridMultilevel"/>
-    <w:tmpl w:val="099618B6"/>
+    <w:tmpl w:val="9F40FE32"/>
     <w:lvl w:ilvl="0" w:tplc="4009000F">
       <w:start w:val="1"/>
       <w:numFmt w:val="decimal"/>
@@ -6215,95 +6699,9 @@
     </w:lvl>
   </w:abstractNum>
   <w:abstractNum w:abstractNumId="2">
-    <w:nsid w:val="4E5B4A02"/>
+    <w:nsid w:val="4A590F86"/>
     <w:multiLevelType w:val="hybridMultilevel"/>
-    <w:tmpl w:val="E8BC0844"/>
-    <w:lvl w:ilvl="0" w:tplc="4009000F">
-      <w:start w:val="1"/>
-      <w:numFmt w:val="decimal"/>
-      <w:lvlText w:val="%1."/>
-      <w:lvlJc w:val="left"/>
-      <w:pPr>
-        <w:ind w:left="720" w:hanging="360"/>
-      </w:pPr>
-    </w:lvl>
-    <w:lvl w:ilvl="1" w:tplc="40090019">
-      <w:start w:val="1"/>
-      <w:numFmt w:val="lowerLetter"/>
-      <w:lvlText w:val="%2."/>
-      <w:lvlJc w:val="left"/>
-      <w:pPr>
-        <w:ind w:left="1440" w:hanging="360"/>
-      </w:pPr>
-    </w:lvl>
-    <w:lvl w:ilvl="2" w:tplc="4009001B">
-      <w:start w:val="1"/>
-      <w:numFmt w:val="lowerRoman"/>
-      <w:lvlText w:val="%3."/>
-      <w:lvlJc w:val="right"/>
-      <w:pPr>
-        <w:ind w:left="2160" w:hanging="180"/>
-      </w:pPr>
-    </w:lvl>
-    <w:lvl w:ilvl="3" w:tplc="4009000F">
-      <w:start w:val="1"/>
-      <w:numFmt w:val="decimal"/>
-      <w:lvlText w:val="%4."/>
-      <w:lvlJc w:val="left"/>
-      <w:pPr>
-        <w:ind w:left="2880" w:hanging="360"/>
-      </w:pPr>
-    </w:lvl>
-    <w:lvl w:ilvl="4" w:tplc="40090019">
-      <w:start w:val="1"/>
-      <w:numFmt w:val="lowerLetter"/>
-      <w:lvlText w:val="%5."/>
-      <w:lvlJc w:val="left"/>
-      <w:pPr>
-        <w:ind w:left="3600" w:hanging="360"/>
-      </w:pPr>
-    </w:lvl>
-    <w:lvl w:ilvl="5" w:tplc="4009001B">
-      <w:start w:val="1"/>
-      <w:numFmt w:val="lowerRoman"/>
-      <w:lvlText w:val="%6."/>
-      <w:lvlJc w:val="right"/>
-      <w:pPr>
-        <w:ind w:left="4320" w:hanging="180"/>
-      </w:pPr>
-    </w:lvl>
-    <w:lvl w:ilvl="6" w:tplc="4009000F">
-      <w:start w:val="1"/>
-      <w:numFmt w:val="decimal"/>
-      <w:lvlText w:val="%7."/>
-      <w:lvlJc w:val="left"/>
-      <w:pPr>
-        <w:ind w:left="5040" w:hanging="360"/>
-      </w:pPr>
-    </w:lvl>
-    <w:lvl w:ilvl="7" w:tplc="40090019">
-      <w:start w:val="1"/>
-      <w:numFmt w:val="lowerLetter"/>
-      <w:lvlText w:val="%8."/>
-      <w:lvlJc w:val="left"/>
-      <w:pPr>
-        <w:ind w:left="5760" w:hanging="360"/>
-      </w:pPr>
-    </w:lvl>
-    <w:lvl w:ilvl="8" w:tplc="4009001B">
-      <w:start w:val="1"/>
-      <w:numFmt w:val="lowerRoman"/>
-      <w:lvlText w:val="%9."/>
-      <w:lvlJc w:val="right"/>
-      <w:pPr>
-        <w:ind w:left="6480" w:hanging="180"/>
-      </w:pPr>
-    </w:lvl>
-  </w:abstractNum>
-  <w:abstractNum w:abstractNumId="3">
-    <w:nsid w:val="79C1442D"/>
-    <w:multiLevelType w:val="hybridMultilevel"/>
-    <w:tmpl w:val="5E50A9F0"/>
+    <w:tmpl w:val="099618B6"/>
     <w:lvl w:ilvl="0" w:tplc="4009000F">
       <w:start w:val="1"/>
       <w:numFmt w:val="decimal"/>
@@ -6389,17 +6787,192 @@
       </w:pPr>
     </w:lvl>
   </w:abstractNum>
+  <w:abstractNum w:abstractNumId="3">
+    <w:nsid w:val="4E5B4A02"/>
+    <w:multiLevelType w:val="hybridMultilevel"/>
+    <w:tmpl w:val="E8BC0844"/>
+    <w:lvl w:ilvl="0" w:tplc="4009000F">
+      <w:start w:val="1"/>
+      <w:numFmt w:val="decimal"/>
+      <w:lvlText w:val="%1."/>
+      <w:lvlJc w:val="left"/>
+      <w:pPr>
+        <w:ind w:left="720" w:hanging="360"/>
+      </w:pPr>
+    </w:lvl>
+    <w:lvl w:ilvl="1" w:tplc="40090019">
+      <w:start w:val="1"/>
+      <w:numFmt w:val="lowerLetter"/>
+      <w:lvlText w:val="%2."/>
+      <w:lvlJc w:val="left"/>
+      <w:pPr>
+        <w:ind w:left="1440" w:hanging="360"/>
+      </w:pPr>
+    </w:lvl>
+    <w:lvl w:ilvl="2" w:tplc="4009001B">
+      <w:start w:val="1"/>
+      <w:numFmt w:val="lowerRoman"/>
+      <w:lvlText w:val="%3."/>
+      <w:lvlJc w:val="right"/>
+      <w:pPr>
+        <w:ind w:left="2160" w:hanging="180"/>
+      </w:pPr>
+    </w:lvl>
+    <w:lvl w:ilvl="3" w:tplc="4009000F">
+      <w:start w:val="1"/>
+      <w:numFmt w:val="decimal"/>
+      <w:lvlText w:val="%4."/>
+      <w:lvlJc w:val="left"/>
+      <w:pPr>
+        <w:ind w:left="2880" w:hanging="360"/>
+      </w:pPr>
+    </w:lvl>
+    <w:lvl w:ilvl="4" w:tplc="40090019">
+      <w:start w:val="1"/>
+      <w:numFmt w:val="lowerLetter"/>
+      <w:lvlText w:val="%5."/>
+      <w:lvlJc w:val="left"/>
+      <w:pPr>
+        <w:ind w:left="3600" w:hanging="360"/>
+      </w:pPr>
+    </w:lvl>
+    <w:lvl w:ilvl="5" w:tplc="4009001B">
+      <w:start w:val="1"/>
+      <w:numFmt w:val="lowerRoman"/>
+      <w:lvlText w:val="%6."/>
+      <w:lvlJc w:val="right"/>
+      <w:pPr>
+        <w:ind w:left="4320" w:hanging="180"/>
+      </w:pPr>
+    </w:lvl>
+    <w:lvl w:ilvl="6" w:tplc="4009000F">
+      <w:start w:val="1"/>
+      <w:numFmt w:val="decimal"/>
+      <w:lvlText w:val="%7."/>
+      <w:lvlJc w:val="left"/>
+      <w:pPr>
+        <w:ind w:left="5040" w:hanging="360"/>
+      </w:pPr>
+    </w:lvl>
+    <w:lvl w:ilvl="7" w:tplc="40090019">
+      <w:start w:val="1"/>
+      <w:numFmt w:val="lowerLetter"/>
+      <w:lvlText w:val="%8."/>
+      <w:lvlJc w:val="left"/>
+      <w:pPr>
+        <w:ind w:left="5760" w:hanging="360"/>
+      </w:pPr>
+    </w:lvl>
+    <w:lvl w:ilvl="8" w:tplc="4009001B">
+      <w:start w:val="1"/>
+      <w:numFmt w:val="lowerRoman"/>
+      <w:lvlText w:val="%9."/>
+      <w:lvlJc w:val="right"/>
+      <w:pPr>
+        <w:ind w:left="6480" w:hanging="180"/>
+      </w:pPr>
+    </w:lvl>
+  </w:abstractNum>
+  <w:abstractNum w:abstractNumId="4">
+    <w:nsid w:val="79C1442D"/>
+    <w:multiLevelType w:val="hybridMultilevel"/>
+    <w:tmpl w:val="5E50A9F0"/>
+    <w:lvl w:ilvl="0" w:tplc="4009000F">
+      <w:start w:val="1"/>
+      <w:numFmt w:val="decimal"/>
+      <w:lvlText w:val="%1."/>
+      <w:lvlJc w:val="left"/>
+      <w:pPr>
+        <w:ind w:left="720" w:hanging="360"/>
+      </w:pPr>
+      <w:rPr>
+        <w:rFonts w:hint="default"/>
+      </w:rPr>
+    </w:lvl>
+    <w:lvl w:ilvl="1" w:tplc="40090019">
+      <w:start w:val="1"/>
+      <w:numFmt w:val="lowerLetter"/>
+      <w:lvlText w:val="%2."/>
+      <w:lvlJc w:val="left"/>
+      <w:pPr>
+        <w:ind w:left="1440" w:hanging="360"/>
+      </w:pPr>
+    </w:lvl>
+    <w:lvl w:ilvl="2" w:tplc="4009001B" w:tentative="1">
+      <w:start w:val="1"/>
+      <w:numFmt w:val="lowerRoman"/>
+      <w:lvlText w:val="%3."/>
+      <w:lvlJc w:val="right"/>
+      <w:pPr>
+        <w:ind w:left="2160" w:hanging="180"/>
+      </w:pPr>
+    </w:lvl>
+    <w:lvl w:ilvl="3" w:tplc="4009000F" w:tentative="1">
+      <w:start w:val="1"/>
+      <w:numFmt w:val="decimal"/>
+      <w:lvlText w:val="%4."/>
+      <w:lvlJc w:val="left"/>
+      <w:pPr>
+        <w:ind w:left="2880" w:hanging="360"/>
+      </w:pPr>
+    </w:lvl>
+    <w:lvl w:ilvl="4" w:tplc="40090019" w:tentative="1">
+      <w:start w:val="1"/>
+      <w:numFmt w:val="lowerLetter"/>
+      <w:lvlText w:val="%5."/>
+      <w:lvlJc w:val="left"/>
+      <w:pPr>
+        <w:ind w:left="3600" w:hanging="360"/>
+      </w:pPr>
+    </w:lvl>
+    <w:lvl w:ilvl="5" w:tplc="4009001B" w:tentative="1">
+      <w:start w:val="1"/>
+      <w:numFmt w:val="lowerRoman"/>
+      <w:lvlText w:val="%6."/>
+      <w:lvlJc w:val="right"/>
+      <w:pPr>
+        <w:ind w:left="4320" w:hanging="180"/>
+      </w:pPr>
+    </w:lvl>
+    <w:lvl w:ilvl="6" w:tplc="4009000F" w:tentative="1">
+      <w:start w:val="1"/>
+      <w:numFmt w:val="decimal"/>
+      <w:lvlText w:val="%7."/>
+      <w:lvlJc w:val="left"/>
+      <w:pPr>
+        <w:ind w:left="5040" w:hanging="360"/>
+      </w:pPr>
+    </w:lvl>
+    <w:lvl w:ilvl="7" w:tplc="40090019" w:tentative="1">
+      <w:start w:val="1"/>
+      <w:numFmt w:val="lowerLetter"/>
+      <w:lvlText w:val="%8."/>
+      <w:lvlJc w:val="left"/>
+      <w:pPr>
+        <w:ind w:left="5760" w:hanging="360"/>
+      </w:pPr>
+    </w:lvl>
+    <w:lvl w:ilvl="8" w:tplc="4009001B" w:tentative="1">
+      <w:start w:val="1"/>
+      <w:numFmt w:val="lowerRoman"/>
+      <w:lvlText w:val="%9."/>
+      <w:lvlJc w:val="right"/>
+      <w:pPr>
+        <w:ind w:left="6480" w:hanging="180"/>
+      </w:pPr>
+    </w:lvl>
+  </w:abstractNum>
   <w:num w:numId="1">
-    <w:abstractNumId w:val="3"/>
+    <w:abstractNumId w:val="4"/>
   </w:num>
   <w:num w:numId="2">
     <w:abstractNumId w:val="0"/>
   </w:num>
   <w:num w:numId="3">
-    <w:abstractNumId w:val="1"/>
+    <w:abstractNumId w:val="2"/>
   </w:num>
   <w:num w:numId="4">
-    <w:abstractNumId w:val="2"/>
+    <w:abstractNumId w:val="3"/>
     <w:lvlOverride w:ilvl="0">
       <w:startOverride w:val="1"/>
     </w:lvlOverride>
@@ -6429,7 +7002,10 @@
     </w:lvlOverride>
   </w:num>
   <w:num w:numId="5">
-    <w:abstractNumId w:val="2"/>
+    <w:abstractNumId w:val="3"/>
+  </w:num>
+  <w:num w:numId="6">
+    <w:abstractNumId w:val="1"/>
   </w:num>
 </w:numbering>
 </file>

</xml_diff>

<commit_message>
Date: 27 Jan 2026
</commit_message>
<xml_diff>
--- a/Assignments_SA2510014.docx
+++ b/Assignments_SA2510014.docx
@@ -84,6 +84,7 @@
         </w:rPr>
         <w:t xml:space="preserve">What is the purpose and return type of method </w:t>
       </w:r>
+      <w:proofErr w:type="gramStart"/>
       <w:r>
         <w:rPr>
           <w:b/>
@@ -92,7 +93,18 @@
           <w:szCs w:val="22"/>
           <w:lang w:val="en-US"/>
         </w:rPr>
-        <w:t>getPageSource()?</w:t>
+        <w:t>getPageSource(</w:t>
+      </w:r>
+      <w:proofErr w:type="gramEnd"/>
+      <w:r>
+        <w:rPr>
+          <w:b/>
+          <w:bCs/>
+          <w:sz w:val="24"/>
+          <w:szCs w:val="22"/>
+          <w:lang w:val="en-US"/>
+        </w:rPr>
+        <w:t>)?</w:t>
       </w:r>
     </w:p>
     <w:p>
@@ -147,7 +159,25 @@
           <w:szCs w:val="22"/>
           <w:lang w:val="en-US"/>
         </w:rPr>
-        <w:t>Enter your name as user name (abhinav)</w:t>
+        <w:t>Enter your name as user name (</w:t>
+      </w:r>
+      <w:proofErr w:type="spellStart"/>
+      <w:r>
+        <w:rPr>
+          <w:sz w:val="24"/>
+          <w:szCs w:val="22"/>
+          <w:lang w:val="en-US"/>
+        </w:rPr>
+        <w:t>abhinav</w:t>
+      </w:r>
+      <w:proofErr w:type="spellEnd"/>
+      <w:r>
+        <w:rPr>
+          <w:sz w:val="24"/>
+          <w:szCs w:val="22"/>
+          <w:lang w:val="en-US"/>
+        </w:rPr>
+        <w:t>)</w:t>
       </w:r>
     </w:p>
     <w:p>
@@ -264,7 +294,25 @@
           <w:szCs w:val="22"/>
           <w:lang w:val="en-US"/>
         </w:rPr>
-        <w:t>Enter your name as user name (abhinav)</w:t>
+        <w:t>Enter your name as user name (</w:t>
+      </w:r>
+      <w:proofErr w:type="spellStart"/>
+      <w:r>
+        <w:rPr>
+          <w:sz w:val="24"/>
+          <w:szCs w:val="22"/>
+          <w:lang w:val="en-US"/>
+        </w:rPr>
+        <w:t>abhinav</w:t>
+      </w:r>
+      <w:proofErr w:type="spellEnd"/>
+      <w:r>
+        <w:rPr>
+          <w:sz w:val="24"/>
+          <w:szCs w:val="22"/>
+          <w:lang w:val="en-US"/>
+        </w:rPr>
+        <w:t>)</w:t>
       </w:r>
     </w:p>
     <w:p>
@@ -381,7 +429,25 @@
           <w:szCs w:val="22"/>
           <w:lang w:val="en-US"/>
         </w:rPr>
-        <w:t>Enter your name as user name (abhinav)</w:t>
+        <w:t>Enter your name as user name (</w:t>
+      </w:r>
+      <w:proofErr w:type="spellStart"/>
+      <w:r>
+        <w:rPr>
+          <w:sz w:val="24"/>
+          <w:szCs w:val="22"/>
+          <w:lang w:val="en-US"/>
+        </w:rPr>
+        <w:t>abhinav</w:t>
+      </w:r>
+      <w:proofErr w:type="spellEnd"/>
+      <w:r>
+        <w:rPr>
+          <w:sz w:val="24"/>
+          <w:szCs w:val="22"/>
+          <w:lang w:val="en-US"/>
+        </w:rPr>
+        <w:t>)</w:t>
       </w:r>
     </w:p>
     <w:p>
@@ -2011,7 +2077,25 @@
           <w:szCs w:val="24"/>
           <w:lang w:val="en-US"/>
         </w:rPr>
-        <w:t>Display the status of all 7 checkboxes (Monday, Tuesday etc)</w:t>
+        <w:t xml:space="preserve">Display the status of all 7 checkboxes (Monday, Tuesday </w:t>
+      </w:r>
+      <w:proofErr w:type="spellStart"/>
+      <w:r>
+        <w:rPr>
+          <w:sz w:val="24"/>
+          <w:szCs w:val="24"/>
+          <w:lang w:val="en-US"/>
+        </w:rPr>
+        <w:t>etc</w:t>
+      </w:r>
+      <w:proofErr w:type="spellEnd"/>
+      <w:r>
+        <w:rPr>
+          <w:sz w:val="24"/>
+          <w:szCs w:val="24"/>
+          <w:lang w:val="en-US"/>
+        </w:rPr>
+        <w:t>)</w:t>
       </w:r>
     </w:p>
     <w:p>
@@ -2450,6 +2534,7 @@
         </w:rPr>
         <w:br/>
       </w:r>
+      <w:proofErr w:type="spellStart"/>
       <w:r>
         <w:rPr>
           <w:rFonts w:ascii="Consolas" w:hAnsi="Consolas" w:cs="Consolas"/>
@@ -2482,7 +2567,18 @@
           <w:szCs w:val="28"/>
           <w:shd w:val="clear" w:color="auto" w:fill="E8F2FE"/>
         </w:rPr>
-        <w:t>.println(</w:t>
+        <w:t>.println</w:t>
+      </w:r>
+      <w:proofErr w:type="spellEnd"/>
+      <w:r>
+        <w:rPr>
+          <w:rFonts w:ascii="Consolas" w:hAnsi="Consolas" w:cs="Consolas"/>
+          <w:color w:val="000000"/>
+          <w:sz w:val="28"/>
+          <w:szCs w:val="28"/>
+          <w:shd w:val="clear" w:color="auto" w:fill="E8F2FE"/>
+        </w:rPr>
+        <w:t>(</w:t>
       </w:r>
       <w:r>
         <w:rPr>
@@ -2504,6 +2600,7 @@
         </w:rPr>
         <w:t xml:space="preserve"> + </w:t>
       </w:r>
+      <w:proofErr w:type="spellStart"/>
       <w:r>
         <w:rPr>
           <w:rFonts w:ascii="Consolas" w:hAnsi="Consolas" w:cs="Consolas"/>
@@ -2523,7 +2620,18 @@
           <w:szCs w:val="28"/>
           <w:shd w:val="clear" w:color="auto" w:fill="E8F2FE"/>
         </w:rPr>
-        <w:t xml:space="preserve">.getFirstSelectedOption().getText() + </w:t>
+        <w:t>.getFirstSelectedOption</w:t>
+      </w:r>
+      <w:proofErr w:type="spellEnd"/>
+      <w:r>
+        <w:rPr>
+          <w:rFonts w:ascii="Consolas" w:hAnsi="Consolas" w:cs="Consolas"/>
+          <w:color w:val="000000"/>
+          <w:sz w:val="28"/>
+          <w:szCs w:val="28"/>
+          <w:shd w:val="clear" w:color="auto" w:fill="E8F2FE"/>
+        </w:rPr>
+        <w:t xml:space="preserve">().getText() + </w:t>
       </w:r>
       <w:r>
         <w:rPr>
@@ -2545,6 +2653,7 @@
         </w:rPr>
         <w:t xml:space="preserve"> + </w:t>
       </w:r>
+      <w:proofErr w:type="spellStart"/>
       <w:r>
         <w:rPr>
           <w:rFonts w:ascii="Consolas" w:hAnsi="Consolas" w:cs="Consolas"/>
@@ -2564,7 +2673,18 @@
           <w:szCs w:val="28"/>
           <w:shd w:val="clear" w:color="auto" w:fill="E8F2FE"/>
         </w:rPr>
-        <w:t xml:space="preserve">.getFirstSelectedOption().getText() + </w:t>
+        <w:t>.getFirstSelectedOption</w:t>
+      </w:r>
+      <w:proofErr w:type="spellEnd"/>
+      <w:r>
+        <w:rPr>
+          <w:rFonts w:ascii="Consolas" w:hAnsi="Consolas" w:cs="Consolas"/>
+          <w:color w:val="000000"/>
+          <w:sz w:val="28"/>
+          <w:szCs w:val="28"/>
+          <w:shd w:val="clear" w:color="auto" w:fill="E8F2FE"/>
+        </w:rPr>
+        <w:t xml:space="preserve">().getText() + </w:t>
       </w:r>
       <w:r>
         <w:rPr>
@@ -2586,6 +2706,7 @@
         </w:rPr>
         <w:t xml:space="preserve"> + </w:t>
       </w:r>
+      <w:proofErr w:type="spellStart"/>
       <w:r>
         <w:rPr>
           <w:rFonts w:ascii="Consolas" w:hAnsi="Consolas" w:cs="Consolas"/>
@@ -2605,7 +2726,18 @@
           <w:szCs w:val="28"/>
           <w:shd w:val="clear" w:color="auto" w:fill="E8F2FE"/>
         </w:rPr>
-        <w:t>.getFirstSelectedOption().getText());</w:t>
+        <w:t>.getFirstSelectedOption</w:t>
+      </w:r>
+      <w:proofErr w:type="spellEnd"/>
+      <w:r>
+        <w:rPr>
+          <w:rFonts w:ascii="Consolas" w:hAnsi="Consolas" w:cs="Consolas"/>
+          <w:color w:val="000000"/>
+          <w:sz w:val="28"/>
+          <w:szCs w:val="28"/>
+          <w:shd w:val="clear" w:color="auto" w:fill="E8F2FE"/>
+        </w:rPr>
+        <w:t>().getText());</w:t>
       </w:r>
     </w:p>
     <w:p>
@@ -3050,7 +3182,27 @@
           <w:highlight w:val="yellow"/>
           <w:lang w:val="en-US"/>
         </w:rPr>
-        <w:t>Enter first 4 characters from your city (Kolhapur – kolh)</w:t>
+        <w:t xml:space="preserve">Enter first 4 characters from your city (Kolhapur – </w:t>
+      </w:r>
+      <w:proofErr w:type="spellStart"/>
+      <w:r>
+        <w:rPr>
+          <w:sz w:val="24"/>
+          <w:szCs w:val="24"/>
+          <w:highlight w:val="yellow"/>
+          <w:lang w:val="en-US"/>
+        </w:rPr>
+        <w:t>kolh</w:t>
+      </w:r>
+      <w:proofErr w:type="spellEnd"/>
+      <w:r>
+        <w:rPr>
+          <w:sz w:val="24"/>
+          <w:szCs w:val="24"/>
+          <w:highlight w:val="yellow"/>
+          <w:lang w:val="en-US"/>
+        </w:rPr>
+        <w:t>)</w:t>
       </w:r>
     </w:p>
     <w:p>
@@ -4079,8 +4231,19 @@
           <w:highlight w:val="yellow"/>
           <w:lang w:val="en-US"/>
         </w:rPr>
-        <w:t>Login using data provided in step no h &amp; i</w:t>
-      </w:r>
+        <w:t xml:space="preserve">Login using data provided in step no h &amp; </w:t>
+      </w:r>
+      <w:proofErr w:type="spellStart"/>
+      <w:r>
+        <w:rPr>
+          <w:sz w:val="24"/>
+          <w:szCs w:val="24"/>
+          <w:highlight w:val="yellow"/>
+          <w:lang w:val="en-US"/>
+        </w:rPr>
+        <w:t>i</w:t>
+      </w:r>
+      <w:proofErr w:type="spellEnd"/>
     </w:p>
     <w:p>
       <w:pPr>
@@ -4879,7 +5042,25 @@
           <w:szCs w:val="24"/>
           <w:lang w:val="en-US"/>
         </w:rPr>
-        <w:t>Click on ClickToGetAlert button</w:t>
+        <w:t xml:space="preserve">Click on </w:t>
+      </w:r>
+      <w:proofErr w:type="spellStart"/>
+      <w:r>
+        <w:rPr>
+          <w:sz w:val="24"/>
+          <w:szCs w:val="24"/>
+          <w:lang w:val="en-US"/>
+        </w:rPr>
+        <w:t>ClickToGetAlert</w:t>
+      </w:r>
+      <w:proofErr w:type="spellEnd"/>
+      <w:r>
+        <w:rPr>
+          <w:sz w:val="24"/>
+          <w:szCs w:val="24"/>
+          <w:lang w:val="en-US"/>
+        </w:rPr>
+        <w:t xml:space="preserve"> button</w:t>
       </w:r>
     </w:p>
     <w:p>
@@ -4948,7 +5129,25 @@
           <w:szCs w:val="24"/>
           <w:lang w:val="en-US"/>
         </w:rPr>
-        <w:t>Click on GetPrompt Button</w:t>
+        <w:t xml:space="preserve">Click on </w:t>
+      </w:r>
+      <w:proofErr w:type="spellStart"/>
+      <w:r>
+        <w:rPr>
+          <w:sz w:val="24"/>
+          <w:szCs w:val="24"/>
+          <w:lang w:val="en-US"/>
+        </w:rPr>
+        <w:t>GetPrompt</w:t>
+      </w:r>
+      <w:proofErr w:type="spellEnd"/>
+      <w:r>
+        <w:rPr>
+          <w:sz w:val="24"/>
+          <w:szCs w:val="24"/>
+          <w:lang w:val="en-US"/>
+        </w:rPr>
+        <w:t xml:space="preserve"> Button</w:t>
       </w:r>
     </w:p>
     <w:p>
@@ -5017,7 +5216,25 @@
           <w:szCs w:val="24"/>
           <w:lang w:val="en-US"/>
         </w:rPr>
-        <w:t xml:space="preserve">Click on GetConfirmation Button </w:t>
+        <w:t xml:space="preserve">Click on </w:t>
+      </w:r>
+      <w:proofErr w:type="spellStart"/>
+      <w:r>
+        <w:rPr>
+          <w:sz w:val="24"/>
+          <w:szCs w:val="24"/>
+          <w:lang w:val="en-US"/>
+        </w:rPr>
+        <w:t>GetConfirmation</w:t>
+      </w:r>
+      <w:proofErr w:type="spellEnd"/>
+      <w:r>
+        <w:rPr>
+          <w:sz w:val="24"/>
+          <w:szCs w:val="24"/>
+          <w:lang w:val="en-US"/>
+        </w:rPr>
+        <w:t xml:space="preserve"> Button </w:t>
       </w:r>
     </w:p>
     <w:p>
@@ -6545,9 +6762,653 @@
         </w:rPr>
         <w:t>Add assertion part too.</w:t>
       </w:r>
+    </w:p>
+    <w:p>
+      <w:pPr>
+        <w:pStyle w:val="ListParagraph"/>
+        <w:numPr>
+          <w:ilvl w:val="0"/>
+          <w:numId w:val="6"/>
+        </w:numPr>
+        <w:rPr>
+          <w:sz w:val="24"/>
+          <w:szCs w:val="22"/>
+          <w:lang w:val="en-US"/>
+        </w:rPr>
+      </w:pPr>
+      <w:r>
+        <w:rPr>
+          <w:sz w:val="24"/>
+          <w:szCs w:val="22"/>
+          <w:lang w:val="en-US"/>
+        </w:rPr>
+        <w:t>Complete assignment no 25 with using Page Object Model.</w:t>
+      </w:r>
+    </w:p>
+    <w:p>
+      <w:pPr>
+        <w:pStyle w:val="ListParagraph"/>
+        <w:numPr>
+          <w:ilvl w:val="0"/>
+          <w:numId w:val="6"/>
+        </w:numPr>
+        <w:rPr>
+          <w:sz w:val="24"/>
+          <w:szCs w:val="22"/>
+          <w:lang w:val="en-US"/>
+        </w:rPr>
+      </w:pPr>
+      <w:r>
+        <w:rPr>
+          <w:sz w:val="24"/>
+          <w:szCs w:val="22"/>
+          <w:lang w:val="en-US"/>
+        </w:rPr>
+        <w:t>Create following structure in Excel using Apache POI</w:t>
+      </w:r>
+    </w:p>
+    <w:p>
+      <w:pPr>
+        <w:pStyle w:val="ListParagraph"/>
+        <w:numPr>
+          <w:ilvl w:val="1"/>
+          <w:numId w:val="6"/>
+        </w:numPr>
+        <w:rPr>
+          <w:sz w:val="24"/>
+          <w:szCs w:val="22"/>
+          <w:lang w:val="en-US"/>
+        </w:rPr>
+      </w:pPr>
+      <w:r>
+        <w:rPr>
+          <w:sz w:val="24"/>
+          <w:szCs w:val="22"/>
+          <w:lang w:val="en-US"/>
+        </w:rPr>
+        <w:t>Try creating the file using @DataProvider</w:t>
+      </w:r>
       <w:bookmarkStart w:id="0" w:name="_GoBack"/>
       <w:bookmarkEnd w:id="0"/>
     </w:p>
+    <w:tbl>
+      <w:tblPr>
+        <w:tblW w:w="3883" w:type="dxa"/>
+        <w:tblInd w:w="1215" w:type="dxa"/>
+        <w:tblBorders>
+          <w:top w:val="single" w:sz="4" w:space="0" w:color="auto"/>
+          <w:left w:val="single" w:sz="4" w:space="0" w:color="auto"/>
+          <w:bottom w:val="single" w:sz="4" w:space="0" w:color="auto"/>
+          <w:right w:val="single" w:sz="4" w:space="0" w:color="auto"/>
+          <w:insideH w:val="single" w:sz="4" w:space="0" w:color="auto"/>
+          <w:insideV w:val="single" w:sz="4" w:space="0" w:color="auto"/>
+        </w:tblBorders>
+        <w:tblLook w:val="04A0" w:firstRow="1" w:lastRow="0" w:firstColumn="1" w:lastColumn="0" w:noHBand="0" w:noVBand="1"/>
+      </w:tblPr>
+      <w:tblGrid>
+        <w:gridCol w:w="1474"/>
+        <w:gridCol w:w="1284"/>
+        <w:gridCol w:w="1639"/>
+      </w:tblGrid>
+      <w:tr>
+        <w:trPr>
+          <w:trHeight w:val="300"/>
+        </w:trPr>
+        <w:tc>
+          <w:tcPr>
+            <w:tcW w:w="1474" w:type="dxa"/>
+            <w:shd w:val="clear" w:color="auto" w:fill="auto"/>
+            <w:noWrap/>
+            <w:vAlign w:val="bottom"/>
+            <w:hideMark/>
+          </w:tcPr>
+          <w:p>
+            <w:pPr>
+              <w:spacing w:after="0" w:line="240" w:lineRule="auto"/>
+              <w:rPr>
+                <w:rFonts w:ascii="Calibri" w:eastAsia="Times New Roman" w:hAnsi="Calibri" w:cs="Calibri"/>
+                <w:color w:val="000000"/>
+                <w:szCs w:val="22"/>
+                <w:lang w:eastAsia="en-IN"/>
+              </w:rPr>
+            </w:pPr>
+            <w:r>
+              <w:rPr>
+                <w:rFonts w:ascii="Calibri" w:eastAsia="Times New Roman" w:hAnsi="Calibri" w:cs="Calibri"/>
+                <w:color w:val="000000"/>
+                <w:szCs w:val="22"/>
+                <w:lang w:eastAsia="en-IN"/>
+              </w:rPr>
+              <w:t>User Name</w:t>
+            </w:r>
+          </w:p>
+        </w:tc>
+        <w:tc>
+          <w:tcPr>
+            <w:tcW w:w="770" w:type="dxa"/>
+            <w:shd w:val="clear" w:color="auto" w:fill="auto"/>
+            <w:noWrap/>
+            <w:vAlign w:val="bottom"/>
+            <w:hideMark/>
+          </w:tcPr>
+          <w:p>
+            <w:pPr>
+              <w:spacing w:after="0" w:line="240" w:lineRule="auto"/>
+              <w:rPr>
+                <w:rFonts w:ascii="Calibri" w:eastAsia="Times New Roman" w:hAnsi="Calibri" w:cs="Calibri"/>
+                <w:color w:val="000000"/>
+                <w:szCs w:val="22"/>
+                <w:lang w:eastAsia="en-IN"/>
+              </w:rPr>
+            </w:pPr>
+            <w:r>
+              <w:rPr>
+                <w:rFonts w:ascii="Calibri" w:eastAsia="Times New Roman" w:hAnsi="Calibri" w:cs="Calibri"/>
+                <w:color w:val="000000"/>
+                <w:szCs w:val="22"/>
+                <w:lang w:eastAsia="en-IN"/>
+              </w:rPr>
+              <w:t>Password</w:t>
+            </w:r>
+          </w:p>
+        </w:tc>
+        <w:tc>
+          <w:tcPr>
+            <w:tcW w:w="1639" w:type="dxa"/>
+            <w:shd w:val="clear" w:color="auto" w:fill="auto"/>
+            <w:noWrap/>
+            <w:vAlign w:val="bottom"/>
+            <w:hideMark/>
+          </w:tcPr>
+          <w:p>
+            <w:pPr>
+              <w:spacing w:after="0" w:line="240" w:lineRule="auto"/>
+              <w:rPr>
+                <w:rFonts w:ascii="Calibri" w:eastAsia="Times New Roman" w:hAnsi="Calibri" w:cs="Calibri"/>
+                <w:color w:val="000000"/>
+                <w:szCs w:val="22"/>
+                <w:lang w:eastAsia="en-IN"/>
+              </w:rPr>
+            </w:pPr>
+            <w:r>
+              <w:rPr>
+                <w:rFonts w:ascii="Calibri" w:eastAsia="Times New Roman" w:hAnsi="Calibri" w:cs="Calibri"/>
+                <w:color w:val="000000"/>
+                <w:szCs w:val="22"/>
+                <w:lang w:eastAsia="en-IN"/>
+              </w:rPr>
+              <w:t>Result</w:t>
+            </w:r>
+          </w:p>
+        </w:tc>
+      </w:tr>
+      <w:tr>
+        <w:trPr>
+          <w:trHeight w:val="300"/>
+        </w:trPr>
+        <w:tc>
+          <w:tcPr>
+            <w:tcW w:w="1474" w:type="dxa"/>
+            <w:shd w:val="clear" w:color="auto" w:fill="auto"/>
+            <w:noWrap/>
+            <w:vAlign w:val="bottom"/>
+            <w:hideMark/>
+          </w:tcPr>
+          <w:p>
+            <w:pPr>
+              <w:spacing w:after="0" w:line="240" w:lineRule="auto"/>
+              <w:rPr>
+                <w:rFonts w:ascii="Calibri" w:eastAsia="Times New Roman" w:hAnsi="Calibri" w:cs="Calibri"/>
+                <w:color w:val="000000"/>
+                <w:szCs w:val="22"/>
+                <w:lang w:eastAsia="en-IN"/>
+              </w:rPr>
+            </w:pPr>
+            <w:r>
+              <w:rPr>
+                <w:rFonts w:ascii="Calibri" w:eastAsia="Times New Roman" w:hAnsi="Calibri" w:cs="Calibri"/>
+                <w:color w:val="000000"/>
+                <w:szCs w:val="22"/>
+                <w:lang w:eastAsia="en-IN"/>
+              </w:rPr>
+              <w:t>admin</w:t>
+            </w:r>
+          </w:p>
+        </w:tc>
+        <w:tc>
+          <w:tcPr>
+            <w:tcW w:w="770" w:type="dxa"/>
+            <w:shd w:val="clear" w:color="auto" w:fill="auto"/>
+            <w:noWrap/>
+            <w:vAlign w:val="bottom"/>
+            <w:hideMark/>
+          </w:tcPr>
+          <w:p>
+            <w:pPr>
+              <w:spacing w:after="0" w:line="240" w:lineRule="auto"/>
+              <w:rPr>
+                <w:rFonts w:ascii="Calibri" w:eastAsia="Times New Roman" w:hAnsi="Calibri" w:cs="Calibri"/>
+                <w:color w:val="000000"/>
+                <w:szCs w:val="22"/>
+                <w:lang w:eastAsia="en-IN"/>
+              </w:rPr>
+            </w:pPr>
+            <w:r>
+              <w:rPr>
+                <w:rFonts w:ascii="Calibri" w:eastAsia="Times New Roman" w:hAnsi="Calibri" w:cs="Calibri"/>
+                <w:color w:val="000000"/>
+                <w:szCs w:val="22"/>
+                <w:lang w:eastAsia="en-IN"/>
+              </w:rPr>
+              <w:t>admin123</w:t>
+            </w:r>
+          </w:p>
+        </w:tc>
+        <w:tc>
+          <w:tcPr>
+            <w:tcW w:w="1639" w:type="dxa"/>
+            <w:shd w:val="clear" w:color="auto" w:fill="auto"/>
+            <w:noWrap/>
+            <w:vAlign w:val="bottom"/>
+            <w:hideMark/>
+          </w:tcPr>
+          <w:p>
+            <w:pPr>
+              <w:spacing w:after="0" w:line="240" w:lineRule="auto"/>
+              <w:rPr>
+                <w:rFonts w:ascii="Calibri" w:eastAsia="Times New Roman" w:hAnsi="Calibri" w:cs="Calibri"/>
+                <w:color w:val="000000"/>
+                <w:szCs w:val="22"/>
+                <w:lang w:eastAsia="en-IN"/>
+              </w:rPr>
+            </w:pPr>
+            <w:r>
+              <w:rPr>
+                <w:rFonts w:ascii="Calibri" w:eastAsia="Times New Roman" w:hAnsi="Calibri" w:cs="Calibri"/>
+                <w:color w:val="000000"/>
+                <w:szCs w:val="22"/>
+                <w:lang w:eastAsia="en-IN"/>
+              </w:rPr>
+              <w:t>Not Run</w:t>
+            </w:r>
+          </w:p>
+        </w:tc>
+      </w:tr>
+      <w:tr>
+        <w:trPr>
+          <w:trHeight w:val="300"/>
+        </w:trPr>
+        <w:tc>
+          <w:tcPr>
+            <w:tcW w:w="1474" w:type="dxa"/>
+            <w:shd w:val="clear" w:color="auto" w:fill="auto"/>
+            <w:noWrap/>
+            <w:vAlign w:val="bottom"/>
+            <w:hideMark/>
+          </w:tcPr>
+          <w:p>
+            <w:pPr>
+              <w:spacing w:after="0" w:line="240" w:lineRule="auto"/>
+              <w:rPr>
+                <w:rFonts w:ascii="Calibri" w:eastAsia="Times New Roman" w:hAnsi="Calibri" w:cs="Calibri"/>
+                <w:color w:val="000000"/>
+                <w:szCs w:val="22"/>
+                <w:lang w:eastAsia="en-IN"/>
+              </w:rPr>
+            </w:pPr>
+            <w:proofErr w:type="spellStart"/>
+            <w:r>
+              <w:rPr>
+                <w:rFonts w:ascii="Calibri" w:eastAsia="Times New Roman" w:hAnsi="Calibri" w:cs="Calibri"/>
+                <w:color w:val="000000"/>
+                <w:szCs w:val="22"/>
+                <w:lang w:eastAsia="en-IN"/>
+              </w:rPr>
+              <w:t>madan</w:t>
+            </w:r>
+            <w:proofErr w:type="spellEnd"/>
+          </w:p>
+        </w:tc>
+        <w:tc>
+          <w:tcPr>
+            <w:tcW w:w="770" w:type="dxa"/>
+            <w:shd w:val="clear" w:color="auto" w:fill="auto"/>
+            <w:noWrap/>
+            <w:vAlign w:val="bottom"/>
+            <w:hideMark/>
+          </w:tcPr>
+          <w:p>
+            <w:pPr>
+              <w:spacing w:after="0" w:line="240" w:lineRule="auto"/>
+              <w:rPr>
+                <w:rFonts w:ascii="Calibri" w:eastAsia="Times New Roman" w:hAnsi="Calibri" w:cs="Calibri"/>
+                <w:color w:val="000000"/>
+                <w:szCs w:val="22"/>
+                <w:lang w:eastAsia="en-IN"/>
+              </w:rPr>
+            </w:pPr>
+            <w:r>
+              <w:rPr>
+                <w:rFonts w:ascii="Calibri" w:eastAsia="Times New Roman" w:hAnsi="Calibri" w:cs="Calibri"/>
+                <w:color w:val="000000"/>
+                <w:szCs w:val="22"/>
+                <w:lang w:eastAsia="en-IN"/>
+              </w:rPr>
+              <w:t>mandan123</w:t>
+            </w:r>
+          </w:p>
+        </w:tc>
+        <w:tc>
+          <w:tcPr>
+            <w:tcW w:w="1639" w:type="dxa"/>
+            <w:shd w:val="clear" w:color="auto" w:fill="auto"/>
+            <w:noWrap/>
+            <w:vAlign w:val="bottom"/>
+            <w:hideMark/>
+          </w:tcPr>
+          <w:p>
+            <w:pPr>
+              <w:spacing w:after="0" w:line="240" w:lineRule="auto"/>
+              <w:rPr>
+                <w:rFonts w:ascii="Calibri" w:eastAsia="Times New Roman" w:hAnsi="Calibri" w:cs="Calibri"/>
+                <w:color w:val="000000"/>
+                <w:szCs w:val="22"/>
+                <w:lang w:eastAsia="en-IN"/>
+              </w:rPr>
+            </w:pPr>
+            <w:r>
+              <w:rPr>
+                <w:rFonts w:ascii="Calibri" w:eastAsia="Times New Roman" w:hAnsi="Calibri" w:cs="Calibri"/>
+                <w:color w:val="000000"/>
+                <w:szCs w:val="22"/>
+                <w:lang w:eastAsia="en-IN"/>
+              </w:rPr>
+              <w:t>Not Run</w:t>
+            </w:r>
+          </w:p>
+        </w:tc>
+      </w:tr>
+      <w:tr>
+        <w:trPr>
+          <w:trHeight w:val="300"/>
+        </w:trPr>
+        <w:tc>
+          <w:tcPr>
+            <w:tcW w:w="1474" w:type="dxa"/>
+            <w:shd w:val="clear" w:color="auto" w:fill="auto"/>
+            <w:noWrap/>
+            <w:vAlign w:val="bottom"/>
+            <w:hideMark/>
+          </w:tcPr>
+          <w:p>
+            <w:pPr>
+              <w:spacing w:after="0" w:line="240" w:lineRule="auto"/>
+              <w:rPr>
+                <w:rFonts w:ascii="Calibri" w:eastAsia="Times New Roman" w:hAnsi="Calibri" w:cs="Calibri"/>
+                <w:color w:val="000000"/>
+                <w:szCs w:val="22"/>
+                <w:lang w:eastAsia="en-IN"/>
+              </w:rPr>
+            </w:pPr>
+            <w:proofErr w:type="spellStart"/>
+            <w:r>
+              <w:rPr>
+                <w:rFonts w:ascii="Calibri" w:eastAsia="Times New Roman" w:hAnsi="Calibri" w:cs="Calibri"/>
+                <w:color w:val="000000"/>
+                <w:szCs w:val="22"/>
+                <w:lang w:eastAsia="en-IN"/>
+              </w:rPr>
+              <w:t>ankit</w:t>
+            </w:r>
+            <w:proofErr w:type="spellEnd"/>
+          </w:p>
+        </w:tc>
+        <w:tc>
+          <w:tcPr>
+            <w:tcW w:w="770" w:type="dxa"/>
+            <w:shd w:val="clear" w:color="auto" w:fill="auto"/>
+            <w:noWrap/>
+            <w:vAlign w:val="bottom"/>
+            <w:hideMark/>
+          </w:tcPr>
+          <w:p>
+            <w:pPr>
+              <w:spacing w:after="0" w:line="240" w:lineRule="auto"/>
+              <w:rPr>
+                <w:rFonts w:ascii="Calibri" w:eastAsia="Times New Roman" w:hAnsi="Calibri" w:cs="Calibri"/>
+                <w:color w:val="000000"/>
+                <w:szCs w:val="22"/>
+                <w:lang w:eastAsia="en-IN"/>
+              </w:rPr>
+            </w:pPr>
+            <w:r>
+              <w:rPr>
+                <w:rFonts w:ascii="Calibri" w:eastAsia="Times New Roman" w:hAnsi="Calibri" w:cs="Calibri"/>
+                <w:color w:val="000000"/>
+                <w:szCs w:val="22"/>
+                <w:lang w:eastAsia="en-IN"/>
+              </w:rPr>
+              <w:t>ankit123</w:t>
+            </w:r>
+          </w:p>
+        </w:tc>
+        <w:tc>
+          <w:tcPr>
+            <w:tcW w:w="1639" w:type="dxa"/>
+            <w:shd w:val="clear" w:color="auto" w:fill="auto"/>
+            <w:noWrap/>
+            <w:vAlign w:val="bottom"/>
+            <w:hideMark/>
+          </w:tcPr>
+          <w:p>
+            <w:pPr>
+              <w:spacing w:after="0" w:line="240" w:lineRule="auto"/>
+              <w:rPr>
+                <w:rFonts w:ascii="Calibri" w:eastAsia="Times New Roman" w:hAnsi="Calibri" w:cs="Calibri"/>
+                <w:color w:val="000000"/>
+                <w:szCs w:val="22"/>
+                <w:lang w:eastAsia="en-IN"/>
+              </w:rPr>
+            </w:pPr>
+            <w:r>
+              <w:rPr>
+                <w:rFonts w:ascii="Calibri" w:eastAsia="Times New Roman" w:hAnsi="Calibri" w:cs="Calibri"/>
+                <w:color w:val="000000"/>
+                <w:szCs w:val="22"/>
+                <w:lang w:eastAsia="en-IN"/>
+              </w:rPr>
+              <w:t>Not Run</w:t>
+            </w:r>
+          </w:p>
+        </w:tc>
+      </w:tr>
+      <w:tr>
+        <w:trPr>
+          <w:trHeight w:val="300"/>
+        </w:trPr>
+        <w:tc>
+          <w:tcPr>
+            <w:tcW w:w="1474" w:type="dxa"/>
+            <w:shd w:val="clear" w:color="auto" w:fill="auto"/>
+            <w:noWrap/>
+            <w:vAlign w:val="bottom"/>
+            <w:hideMark/>
+          </w:tcPr>
+          <w:p>
+            <w:pPr>
+              <w:spacing w:after="0" w:line="240" w:lineRule="auto"/>
+              <w:rPr>
+                <w:rFonts w:ascii="Calibri" w:eastAsia="Times New Roman" w:hAnsi="Calibri" w:cs="Calibri"/>
+                <w:color w:val="000000"/>
+                <w:szCs w:val="22"/>
+                <w:lang w:eastAsia="en-IN"/>
+              </w:rPr>
+            </w:pPr>
+            <w:r>
+              <w:rPr>
+                <w:rFonts w:ascii="Calibri" w:eastAsia="Times New Roman" w:hAnsi="Calibri" w:cs="Calibri"/>
+                <w:color w:val="000000"/>
+                <w:szCs w:val="22"/>
+                <w:lang w:eastAsia="en-IN"/>
+              </w:rPr>
+              <w:t>admin</w:t>
+            </w:r>
+          </w:p>
+        </w:tc>
+        <w:tc>
+          <w:tcPr>
+            <w:tcW w:w="770" w:type="dxa"/>
+            <w:shd w:val="clear" w:color="auto" w:fill="auto"/>
+            <w:noWrap/>
+            <w:vAlign w:val="bottom"/>
+            <w:hideMark/>
+          </w:tcPr>
+          <w:p>
+            <w:pPr>
+              <w:spacing w:after="0" w:line="240" w:lineRule="auto"/>
+              <w:rPr>
+                <w:rFonts w:ascii="Calibri" w:eastAsia="Times New Roman" w:hAnsi="Calibri" w:cs="Calibri"/>
+                <w:color w:val="000000"/>
+                <w:szCs w:val="22"/>
+                <w:lang w:eastAsia="en-IN"/>
+              </w:rPr>
+            </w:pPr>
+            <w:r>
+              <w:rPr>
+                <w:rFonts w:ascii="Calibri" w:eastAsia="Times New Roman" w:hAnsi="Calibri" w:cs="Calibri"/>
+                <w:color w:val="000000"/>
+                <w:szCs w:val="22"/>
+                <w:lang w:eastAsia="en-IN"/>
+              </w:rPr>
+              <w:t>admin123</w:t>
+            </w:r>
+          </w:p>
+        </w:tc>
+        <w:tc>
+          <w:tcPr>
+            <w:tcW w:w="1639" w:type="dxa"/>
+            <w:shd w:val="clear" w:color="auto" w:fill="auto"/>
+            <w:noWrap/>
+            <w:vAlign w:val="bottom"/>
+            <w:hideMark/>
+          </w:tcPr>
+          <w:p>
+            <w:pPr>
+              <w:spacing w:after="0" w:line="240" w:lineRule="auto"/>
+              <w:rPr>
+                <w:rFonts w:ascii="Calibri" w:eastAsia="Times New Roman" w:hAnsi="Calibri" w:cs="Calibri"/>
+                <w:color w:val="000000"/>
+                <w:szCs w:val="22"/>
+                <w:lang w:eastAsia="en-IN"/>
+              </w:rPr>
+            </w:pPr>
+            <w:r>
+              <w:rPr>
+                <w:rFonts w:ascii="Calibri" w:eastAsia="Times New Roman" w:hAnsi="Calibri" w:cs="Calibri"/>
+                <w:color w:val="000000"/>
+                <w:szCs w:val="22"/>
+                <w:lang w:eastAsia="en-IN"/>
+              </w:rPr>
+              <w:t>Not Run</w:t>
+            </w:r>
+          </w:p>
+        </w:tc>
+      </w:tr>
+      <w:tr>
+        <w:trPr>
+          <w:trHeight w:val="300"/>
+        </w:trPr>
+        <w:tc>
+          <w:tcPr>
+            <w:tcW w:w="1474" w:type="dxa"/>
+            <w:shd w:val="clear" w:color="auto" w:fill="auto"/>
+            <w:noWrap/>
+            <w:vAlign w:val="bottom"/>
+            <w:hideMark/>
+          </w:tcPr>
+          <w:p>
+            <w:pPr>
+              <w:spacing w:after="0" w:line="240" w:lineRule="auto"/>
+              <w:rPr>
+                <w:rFonts w:ascii="Calibri" w:eastAsia="Times New Roman" w:hAnsi="Calibri" w:cs="Calibri"/>
+                <w:color w:val="000000"/>
+                <w:szCs w:val="22"/>
+                <w:lang w:eastAsia="en-IN"/>
+              </w:rPr>
+            </w:pPr>
+            <w:proofErr w:type="spellStart"/>
+            <w:r>
+              <w:rPr>
+                <w:rFonts w:ascii="Calibri" w:eastAsia="Times New Roman" w:hAnsi="Calibri" w:cs="Calibri"/>
+                <w:color w:val="000000"/>
+                <w:szCs w:val="22"/>
+                <w:lang w:eastAsia="en-IN"/>
+              </w:rPr>
+              <w:t>abhinav</w:t>
+            </w:r>
+            <w:proofErr w:type="spellEnd"/>
+          </w:p>
+        </w:tc>
+        <w:tc>
+          <w:tcPr>
+            <w:tcW w:w="770" w:type="dxa"/>
+            <w:shd w:val="clear" w:color="auto" w:fill="auto"/>
+            <w:noWrap/>
+            <w:vAlign w:val="bottom"/>
+            <w:hideMark/>
+          </w:tcPr>
+          <w:p>
+            <w:pPr>
+              <w:spacing w:after="0" w:line="240" w:lineRule="auto"/>
+              <w:rPr>
+                <w:rFonts w:ascii="Calibri" w:eastAsia="Times New Roman" w:hAnsi="Calibri" w:cs="Calibri"/>
+                <w:color w:val="000000"/>
+                <w:szCs w:val="22"/>
+                <w:lang w:eastAsia="en-IN"/>
+              </w:rPr>
+            </w:pPr>
+            <w:r>
+              <w:rPr>
+                <w:rFonts w:ascii="Calibri" w:eastAsia="Times New Roman" w:hAnsi="Calibri" w:cs="Calibri"/>
+                <w:color w:val="000000"/>
+                <w:szCs w:val="22"/>
+                <w:lang w:eastAsia="en-IN"/>
+              </w:rPr>
+              <w:t>abhinav123</w:t>
+            </w:r>
+          </w:p>
+        </w:tc>
+        <w:tc>
+          <w:tcPr>
+            <w:tcW w:w="1639" w:type="dxa"/>
+            <w:shd w:val="clear" w:color="auto" w:fill="auto"/>
+            <w:noWrap/>
+            <w:vAlign w:val="bottom"/>
+            <w:hideMark/>
+          </w:tcPr>
+          <w:p>
+            <w:pPr>
+              <w:spacing w:after="0" w:line="240" w:lineRule="auto"/>
+              <w:rPr>
+                <w:rFonts w:ascii="Calibri" w:eastAsia="Times New Roman" w:hAnsi="Calibri" w:cs="Calibri"/>
+                <w:color w:val="000000"/>
+                <w:szCs w:val="22"/>
+                <w:lang w:eastAsia="en-IN"/>
+              </w:rPr>
+            </w:pPr>
+            <w:r>
+              <w:rPr>
+                <w:rFonts w:ascii="Calibri" w:eastAsia="Times New Roman" w:hAnsi="Calibri" w:cs="Calibri"/>
+                <w:color w:val="000000"/>
+                <w:szCs w:val="22"/>
+                <w:lang w:eastAsia="en-IN"/>
+              </w:rPr>
+              <w:t>Not Run</w:t>
+            </w:r>
+          </w:p>
+        </w:tc>
+      </w:tr>
+    </w:tbl>
     <w:p>
       <w:pPr>
         <w:pStyle w:val="ListParagraph"/>

</xml_diff>

<commit_message>
Date: 02 Feb 2026
</commit_message>
<xml_diff>
--- a/Assignments_SA2510014.docx
+++ b/Assignments_SA2510014.docx
@@ -6828,8 +6828,6 @@
         </w:rPr>
         <w:t>Try creating the file using @DataProvider</w:t>
       </w:r>
-      <w:bookmarkStart w:id="0" w:name="_GoBack"/>
-      <w:bookmarkEnd w:id="0"/>
     </w:p>
     <w:tbl>
       <w:tblPr>
@@ -7433,6 +7431,208 @@
           <w:lang w:val="en-US"/>
         </w:rPr>
       </w:pPr>
+    </w:p>
+    <w:p>
+      <w:pPr>
+        <w:rPr>
+          <w:b/>
+          <w:bCs/>
+          <w:sz w:val="24"/>
+          <w:szCs w:val="22"/>
+          <w:lang w:val="en-US"/>
+        </w:rPr>
+      </w:pPr>
+      <w:r>
+        <w:rPr>
+          <w:sz w:val="24"/>
+          <w:szCs w:val="22"/>
+          <w:lang w:val="en-US"/>
+        </w:rPr>
+        <w:br w:type="page"/>
+      </w:r>
+      <w:r>
+        <w:rPr>
+          <w:b/>
+          <w:bCs/>
+          <w:sz w:val="24"/>
+          <w:szCs w:val="22"/>
+          <w:lang w:val="en-US"/>
+        </w:rPr>
+        <w:lastRenderedPageBreak/>
+        <w:t>Assignment for Cucumber</w:t>
+      </w:r>
+    </w:p>
+    <w:p>
+      <w:pPr>
+        <w:rPr>
+          <w:sz w:val="24"/>
+          <w:szCs w:val="22"/>
+          <w:highlight w:val="yellow"/>
+          <w:lang w:val="en-US"/>
+        </w:rPr>
+      </w:pPr>
+      <w:r>
+        <w:rPr>
+          <w:sz w:val="24"/>
+          <w:szCs w:val="22"/>
+          <w:highlight w:val="yellow"/>
+          <w:lang w:val="en-US"/>
+        </w:rPr>
+        <w:t>Create 4 Scenarios for testing the links on https://www.selenium.dev/ site</w:t>
+      </w:r>
+    </w:p>
+    <w:p>
+      <w:pPr>
+        <w:rPr>
+          <w:sz w:val="24"/>
+          <w:szCs w:val="22"/>
+          <w:highlight w:val="yellow"/>
+          <w:lang w:val="en-US"/>
+        </w:rPr>
+      </w:pPr>
+      <w:r>
+        <w:rPr>
+          <w:sz w:val="24"/>
+          <w:szCs w:val="22"/>
+          <w:highlight w:val="yellow"/>
+          <w:lang w:val="en-US"/>
+        </w:rPr>
+        <w:t>Click on Downloads</w:t>
+      </w:r>
+    </w:p>
+    <w:p>
+      <w:pPr>
+        <w:rPr>
+          <w:sz w:val="24"/>
+          <w:szCs w:val="22"/>
+          <w:highlight w:val="yellow"/>
+          <w:lang w:val="en-US"/>
+        </w:rPr>
+      </w:pPr>
+      <w:r>
+        <w:rPr>
+          <w:sz w:val="24"/>
+          <w:szCs w:val="22"/>
+          <w:highlight w:val="yellow"/>
+          <w:lang w:val="en-US"/>
+        </w:rPr>
+        <w:t>Verify the title</w:t>
+      </w:r>
+    </w:p>
+    <w:p>
+      <w:pPr>
+        <w:rPr>
+          <w:sz w:val="24"/>
+          <w:szCs w:val="22"/>
+          <w:highlight w:val="yellow"/>
+          <w:lang w:val="en-US"/>
+        </w:rPr>
+      </w:pPr>
+      <w:r>
+        <w:rPr>
+          <w:sz w:val="24"/>
+          <w:szCs w:val="22"/>
+          <w:highlight w:val="yellow"/>
+          <w:lang w:val="en-US"/>
+        </w:rPr>
+        <w:t>Click on Documentation</w:t>
+      </w:r>
+      <w:bookmarkStart w:id="0" w:name="_GoBack"/>
+      <w:bookmarkEnd w:id="0"/>
+    </w:p>
+    <w:p>
+      <w:pPr>
+        <w:rPr>
+          <w:sz w:val="24"/>
+          <w:szCs w:val="22"/>
+          <w:highlight w:val="yellow"/>
+          <w:lang w:val="en-US"/>
+        </w:rPr>
+      </w:pPr>
+      <w:r>
+        <w:rPr>
+          <w:sz w:val="24"/>
+          <w:szCs w:val="22"/>
+          <w:highlight w:val="yellow"/>
+          <w:lang w:val="en-US"/>
+        </w:rPr>
+        <w:t>Verify the title</w:t>
+      </w:r>
+    </w:p>
+    <w:p>
+      <w:pPr>
+        <w:rPr>
+          <w:sz w:val="24"/>
+          <w:szCs w:val="22"/>
+          <w:highlight w:val="yellow"/>
+          <w:lang w:val="en-US"/>
+        </w:rPr>
+      </w:pPr>
+      <w:r>
+        <w:rPr>
+          <w:sz w:val="24"/>
+          <w:szCs w:val="22"/>
+          <w:highlight w:val="yellow"/>
+          <w:lang w:val="en-US"/>
+        </w:rPr>
+        <w:t>Click on Projects</w:t>
+      </w:r>
+    </w:p>
+    <w:p>
+      <w:pPr>
+        <w:rPr>
+          <w:sz w:val="24"/>
+          <w:szCs w:val="22"/>
+          <w:highlight w:val="yellow"/>
+          <w:lang w:val="en-US"/>
+        </w:rPr>
+      </w:pPr>
+      <w:r>
+        <w:rPr>
+          <w:sz w:val="24"/>
+          <w:szCs w:val="22"/>
+          <w:highlight w:val="yellow"/>
+          <w:lang w:val="en-US"/>
+        </w:rPr>
+        <w:t>Verify the title</w:t>
+      </w:r>
+    </w:p>
+    <w:p>
+      <w:pPr>
+        <w:rPr>
+          <w:sz w:val="24"/>
+          <w:szCs w:val="22"/>
+          <w:highlight w:val="yellow"/>
+          <w:lang w:val="en-US"/>
+        </w:rPr>
+      </w:pPr>
+      <w:r>
+        <w:rPr>
+          <w:sz w:val="24"/>
+          <w:szCs w:val="22"/>
+          <w:highlight w:val="yellow"/>
+          <w:lang w:val="en-US"/>
+        </w:rPr>
+        <w:t>Click on support</w:t>
+      </w:r>
+    </w:p>
+    <w:p>
+      <w:pPr>
+        <w:rPr>
+          <w:sz w:val="24"/>
+          <w:szCs w:val="22"/>
+          <w:lang w:val="en-US"/>
+        </w:rPr>
+      </w:pPr>
+      <w:r>
+        <w:rPr>
+          <w:sz w:val="24"/>
+          <w:szCs w:val="22"/>
+          <w:highlight w:val="yellow"/>
+          <w:lang w:val="en-US"/>
+        </w:rPr>
+        <w:t>Verify the title</w:t>
+      </w:r>
     </w:p>
     <w:sectPr>
       <w:pgSz w:w="11906" w:h="16838"/>

</xml_diff>